<commit_message>
actualizacion repo, en este commit no hay nada novedoso solo pocos cambios
</commit_message>
<xml_diff>
--- a/sistemas_operativos/unidad2/practicas/practica6_alias/practica6_alias.docx
+++ b/sistemas_operativos/unidad2/practicas/practica6_alias/practica6_alias.docx
@@ -295,7 +295,7 @@
           <w:sz w:val="36"/>
           <w:szCs w:val="36"/>
         </w:rPr>
-        <w:t>Guillermo Licea Sandoval</w:t>
+        <w:t>Alma Leticia Palacios Guerreo</w:t>
       </w:r>
     </w:p>
     <w:p>
@@ -538,28 +538,14 @@
         <w:rPr>
           <w:rFonts w:ascii="Arial" w:eastAsia="Arial" w:hAnsi="Arial" w:cs="Arial"/>
         </w:rPr>
+        <w:t>&lt;nombre_alias&gt;=”</w:t>
+      </w:r>
+      <w:r>
+        <w:rPr>
+          <w:rFonts w:ascii="Arial" w:eastAsia="Arial" w:hAnsi="Arial" w:cs="Arial"/>
+        </w:rPr>
         <w:t>&lt;</w:t>
       </w:r>
-      <w:proofErr w:type="spellStart"/>
-      <w:r>
-        <w:rPr>
-          <w:rFonts w:ascii="Arial" w:eastAsia="Arial" w:hAnsi="Arial" w:cs="Arial"/>
-        </w:rPr>
-        <w:t>nombre_alias</w:t>
-      </w:r>
-      <w:proofErr w:type="spellEnd"/>
-      <w:r>
-        <w:rPr>
-          <w:rFonts w:ascii="Arial" w:eastAsia="Arial" w:hAnsi="Arial" w:cs="Arial"/>
-        </w:rPr>
-        <w:t>&gt;=”</w:t>
-      </w:r>
-      <w:r>
-        <w:rPr>
-          <w:rFonts w:ascii="Arial" w:eastAsia="Arial" w:hAnsi="Arial" w:cs="Arial"/>
-        </w:rPr>
-        <w:t>&lt;</w:t>
-      </w:r>
       <w:r>
         <w:rPr>
           <w:rFonts w:ascii="Arial" w:eastAsia="Arial" w:hAnsi="Arial" w:cs="Arial"/>
@@ -599,79 +585,33 @@
           <w:b/>
           <w:bCs/>
         </w:rPr>
-        <w:t>$alias lista=”</w:t>
-      </w:r>
-      <w:proofErr w:type="spellStart"/>
-      <w:r>
-        <w:rPr>
-          <w:rFonts w:ascii="Arial" w:eastAsia="Arial" w:hAnsi="Arial" w:cs="Arial"/>
-          <w:b/>
-          <w:bCs/>
-        </w:rPr>
-        <w:t>ls</w:t>
-      </w:r>
-      <w:proofErr w:type="spellEnd"/>
-      <w:r>
-        <w:rPr>
-          <w:rFonts w:ascii="Arial" w:eastAsia="Arial" w:hAnsi="Arial" w:cs="Arial"/>
-          <w:b/>
-          <w:bCs/>
-        </w:rPr>
-        <w:t xml:space="preserve"> -l”</w:t>
-      </w:r>
-    </w:p>
-    <w:p>
-      <w:pPr>
-        <w:rPr>
-          <w:rFonts w:ascii="Arial" w:eastAsia="Arial" w:hAnsi="Arial" w:cs="Arial"/>
-          <w:b/>
-          <w:bCs/>
-        </w:rPr>
-      </w:pPr>
-    </w:p>
-    <w:p>
-      <w:pPr>
-        <w:rPr>
-          <w:rFonts w:ascii="Arial" w:eastAsia="Arial" w:hAnsi="Arial" w:cs="Arial"/>
-          <w:b/>
-          <w:bCs/>
-        </w:rPr>
-      </w:pPr>
-      <w:proofErr w:type="spellStart"/>
-      <w:r>
-        <w:rPr>
-          <w:rFonts w:ascii="Arial" w:eastAsia="Arial" w:hAnsi="Arial" w:cs="Arial"/>
-          <w:b/>
-          <w:bCs/>
-        </w:rPr>
-        <w:t>Comnado</w:t>
-      </w:r>
-      <w:proofErr w:type="spellEnd"/>
-      <w:r>
-        <w:rPr>
-          <w:rFonts w:ascii="Arial" w:eastAsia="Arial" w:hAnsi="Arial" w:cs="Arial"/>
-          <w:b/>
-          <w:bCs/>
-        </w:rPr>
-        <w:t xml:space="preserve"> </w:t>
-      </w:r>
-      <w:proofErr w:type="spellStart"/>
-      <w:r>
-        <w:rPr>
-          <w:rFonts w:ascii="Arial" w:eastAsia="Arial" w:hAnsi="Arial" w:cs="Arial"/>
-          <w:b/>
-          <w:bCs/>
-        </w:rPr>
-        <w:t>unalias</w:t>
-      </w:r>
-      <w:proofErr w:type="spellEnd"/>
-      <w:r>
-        <w:rPr>
-          <w:rFonts w:ascii="Arial" w:eastAsia="Arial" w:hAnsi="Arial" w:cs="Arial"/>
-          <w:b/>
-          <w:bCs/>
-        </w:rPr>
-        <w:t xml:space="preserve">: </w:t>
+        <w:t>$alias lista=”ls -l”</w:t>
+      </w:r>
+    </w:p>
+    <w:p>
+      <w:pPr>
+        <w:rPr>
+          <w:rFonts w:ascii="Arial" w:eastAsia="Arial" w:hAnsi="Arial" w:cs="Arial"/>
+          <w:b/>
+          <w:bCs/>
+        </w:rPr>
+      </w:pPr>
+    </w:p>
+    <w:p>
+      <w:pPr>
+        <w:rPr>
+          <w:rFonts w:ascii="Arial" w:eastAsia="Arial" w:hAnsi="Arial" w:cs="Arial"/>
+          <w:b/>
+          <w:bCs/>
+        </w:rPr>
+      </w:pPr>
+      <w:r>
+        <w:rPr>
+          <w:rFonts w:ascii="Arial" w:eastAsia="Arial" w:hAnsi="Arial" w:cs="Arial"/>
+          <w:b/>
+          <w:bCs/>
+        </w:rPr>
+        <w:t xml:space="preserve">Comnado unalias: </w:t>
       </w:r>
     </w:p>
     <w:p>
@@ -718,74 +658,28 @@
           <w:bCs/>
         </w:rPr>
       </w:pPr>
-      <w:proofErr w:type="spellStart"/>
-      <w:r>
-        <w:rPr>
-          <w:rFonts w:ascii="Arial" w:eastAsia="Arial" w:hAnsi="Arial" w:cs="Arial"/>
-          <w:b/>
-          <w:bCs/>
-        </w:rPr>
-        <w:t>Unalias</w:t>
-      </w:r>
-      <w:proofErr w:type="spellEnd"/>
-      <w:r>
-        <w:rPr>
-          <w:rFonts w:ascii="Arial" w:eastAsia="Arial" w:hAnsi="Arial" w:cs="Arial"/>
-          <w:b/>
-          <w:bCs/>
-        </w:rPr>
-        <w:t xml:space="preserve"> &lt;</w:t>
-      </w:r>
-      <w:proofErr w:type="spellStart"/>
-      <w:r>
-        <w:rPr>
-          <w:rFonts w:ascii="Arial" w:eastAsia="Arial" w:hAnsi="Arial" w:cs="Arial"/>
-          <w:b/>
-          <w:bCs/>
-        </w:rPr>
-        <w:t>nombre_alias</w:t>
-      </w:r>
-      <w:proofErr w:type="spellEnd"/>
-      <w:r>
-        <w:rPr>
-          <w:rFonts w:ascii="Arial" w:eastAsia="Arial" w:hAnsi="Arial" w:cs="Arial"/>
-          <w:b/>
-          <w:bCs/>
-        </w:rPr>
-        <w:t>&gt;</w:t>
-      </w:r>
-    </w:p>
-    <w:p>
-      <w:pPr>
-        <w:rPr>
-          <w:rFonts w:ascii="Arial" w:eastAsia="Arial" w:hAnsi="Arial" w:cs="Arial"/>
-        </w:rPr>
-      </w:pPr>
-      <w:r>
-        <w:rPr>
-          <w:rFonts w:ascii="Arial" w:eastAsia="Arial" w:hAnsi="Arial" w:cs="Arial"/>
-          <w:b/>
-          <w:bCs/>
-        </w:rPr>
-        <w:t xml:space="preserve">Ejemplo: </w:t>
-      </w:r>
-      <w:proofErr w:type="spellStart"/>
-      <w:r>
-        <w:rPr>
-          <w:rFonts w:ascii="Arial" w:eastAsia="Arial" w:hAnsi="Arial" w:cs="Arial"/>
-          <w:b/>
-          <w:bCs/>
-        </w:rPr>
-        <w:t>unalias</w:t>
-      </w:r>
-      <w:proofErr w:type="spellEnd"/>
-      <w:r>
-        <w:rPr>
-          <w:rFonts w:ascii="Arial" w:eastAsia="Arial" w:hAnsi="Arial" w:cs="Arial"/>
-          <w:b/>
-          <w:bCs/>
-        </w:rPr>
-        <w:t xml:space="preserve"> </w:t>
+      <w:r>
+        <w:rPr>
+          <w:rFonts w:ascii="Arial" w:eastAsia="Arial" w:hAnsi="Arial" w:cs="Arial"/>
+          <w:b/>
+          <w:bCs/>
+        </w:rPr>
+        <w:t>Unalias &lt;nombre_alias&gt;</w:t>
+      </w:r>
+    </w:p>
+    <w:p>
+      <w:pPr>
+        <w:rPr>
+          <w:rFonts w:ascii="Arial" w:eastAsia="Arial" w:hAnsi="Arial" w:cs="Arial"/>
+        </w:rPr>
+      </w:pPr>
+      <w:r>
+        <w:rPr>
+          <w:rFonts w:ascii="Arial" w:eastAsia="Arial" w:hAnsi="Arial" w:cs="Arial"/>
+          <w:b/>
+          <w:bCs/>
+        </w:rPr>
+        <w:t xml:space="preserve">Ejemplo: unalias </w:t>
       </w:r>
       <w:r>
         <w:rPr>
@@ -810,7 +704,6 @@
           <w:lang w:val="en-US"/>
         </w:rPr>
       </w:pPr>
-      <w:proofErr w:type="spellStart"/>
       <w:r>
         <w:rPr>
           <w:rFonts w:ascii="Arial" w:eastAsia="Arial" w:hAnsi="Arial" w:cs="Arial"/>
@@ -818,98 +711,42 @@
           <w:bCs/>
           <w:lang w:val="en-US"/>
         </w:rPr>
-        <w:t>Programación</w:t>
-      </w:r>
-      <w:proofErr w:type="spellEnd"/>
-      <w:r>
-        <w:rPr>
-          <w:rFonts w:ascii="Arial" w:eastAsia="Arial" w:hAnsi="Arial" w:cs="Arial"/>
-          <w:b/>
-          <w:bCs/>
+        <w:t xml:space="preserve">Programación de Shell. </w:t>
+      </w:r>
+    </w:p>
+    <w:p>
+      <w:pPr>
+        <w:rPr>
+          <w:rFonts w:ascii="Arial" w:eastAsia="Arial" w:hAnsi="Arial" w:cs="Arial"/>
+        </w:rPr>
+      </w:pPr>
+      <w:r>
+        <w:rPr>
+          <w:rFonts w:ascii="Arial" w:eastAsia="Arial" w:hAnsi="Arial" w:cs="Arial"/>
           <w:lang w:val="en-US"/>
         </w:rPr>
-        <w:t xml:space="preserve"> de Shell. </w:t>
-      </w:r>
-    </w:p>
-    <w:p>
-      <w:pPr>
-        <w:rPr>
-          <w:rFonts w:ascii="Arial" w:eastAsia="Arial" w:hAnsi="Arial" w:cs="Arial"/>
-        </w:rPr>
-      </w:pPr>
-      <w:r>
-        <w:rPr>
-          <w:rFonts w:ascii="Arial" w:eastAsia="Arial" w:hAnsi="Arial" w:cs="Arial"/>
-          <w:lang w:val="en-US"/>
-        </w:rPr>
         <w:t xml:space="preserve">Shell Script. </w:t>
       </w:r>
       <w:r>
         <w:rPr>
           <w:rFonts w:ascii="Arial" w:eastAsia="Arial" w:hAnsi="Arial" w:cs="Arial"/>
         </w:rPr>
-        <w:t xml:space="preserve">Un </w:t>
-      </w:r>
-      <w:proofErr w:type="spellStart"/>
-      <w:r>
-        <w:rPr>
-          <w:rFonts w:ascii="Arial" w:eastAsia="Arial" w:hAnsi="Arial" w:cs="Arial"/>
-        </w:rPr>
-        <w:t>shell</w:t>
-      </w:r>
-      <w:proofErr w:type="spellEnd"/>
-      <w:r>
-        <w:rPr>
-          <w:rFonts w:ascii="Arial" w:eastAsia="Arial" w:hAnsi="Arial" w:cs="Arial"/>
-        </w:rPr>
-        <w:t xml:space="preserve"> script es un archivo de texto ordinario que contiene una colección de uno o más comandos del </w:t>
-      </w:r>
-      <w:proofErr w:type="spellStart"/>
-      <w:r>
-        <w:rPr>
-          <w:rFonts w:ascii="Arial" w:eastAsia="Arial" w:hAnsi="Arial" w:cs="Arial"/>
-        </w:rPr>
-        <w:t>shell</w:t>
-      </w:r>
-      <w:proofErr w:type="spellEnd"/>
-      <w:r>
-        <w:rPr>
-          <w:rFonts w:ascii="Arial" w:eastAsia="Arial" w:hAnsi="Arial" w:cs="Arial"/>
-        </w:rPr>
-        <w:t>.</w:t>
-      </w:r>
-    </w:p>
-    <w:p>
-      <w:pPr>
-        <w:rPr>
-          <w:rFonts w:ascii="Arial" w:eastAsia="Arial" w:hAnsi="Arial" w:cs="Arial"/>
-        </w:rPr>
-      </w:pPr>
-      <w:r>
-        <w:rPr>
-          <w:rFonts w:ascii="Arial" w:eastAsia="Arial" w:hAnsi="Arial" w:cs="Arial"/>
-          <w:b/>
-          <w:bCs/>
-        </w:rPr>
-        <w:t xml:space="preserve">Ventajas del uso de </w:t>
-      </w:r>
-      <w:proofErr w:type="spellStart"/>
-      <w:r>
-        <w:rPr>
-          <w:rFonts w:ascii="Arial" w:eastAsia="Arial" w:hAnsi="Arial" w:cs="Arial"/>
-          <w:b/>
-          <w:bCs/>
-        </w:rPr>
-        <w:t>shell</w:t>
-      </w:r>
-      <w:proofErr w:type="spellEnd"/>
-      <w:r>
-        <w:rPr>
-          <w:rFonts w:ascii="Arial" w:eastAsia="Arial" w:hAnsi="Arial" w:cs="Arial"/>
-          <w:b/>
-          <w:bCs/>
-        </w:rPr>
-        <w:t xml:space="preserve"> scripts</w:t>
+        <w:t>Un shell script es un archivo de texto ordinario que contiene una colección de uno o más comandos del shell.</w:t>
+      </w:r>
+    </w:p>
+    <w:p>
+      <w:pPr>
+        <w:rPr>
+          <w:rFonts w:ascii="Arial" w:eastAsia="Arial" w:hAnsi="Arial" w:cs="Arial"/>
+        </w:rPr>
+      </w:pPr>
+      <w:r>
+        <w:rPr>
+          <w:rFonts w:ascii="Arial" w:eastAsia="Arial" w:hAnsi="Arial" w:cs="Arial"/>
+          <w:b/>
+          <w:bCs/>
+        </w:rPr>
+        <w:t>Ventajas del uso de shell scripts</w:t>
       </w:r>
       <w:r>
         <w:rPr>
@@ -979,25 +816,7 @@
           <w:b/>
           <w:bCs/>
         </w:rPr>
-        <w:t xml:space="preserve">Reglas para escribir un </w:t>
-      </w:r>
-      <w:proofErr w:type="spellStart"/>
-      <w:r>
-        <w:rPr>
-          <w:rFonts w:ascii="Arial" w:eastAsia="Arial" w:hAnsi="Arial" w:cs="Arial"/>
-          <w:b/>
-          <w:bCs/>
-        </w:rPr>
-        <w:t>shell</w:t>
-      </w:r>
-      <w:proofErr w:type="spellEnd"/>
-      <w:r>
-        <w:rPr>
-          <w:rFonts w:ascii="Arial" w:eastAsia="Arial" w:hAnsi="Arial" w:cs="Arial"/>
-          <w:b/>
-          <w:bCs/>
-        </w:rPr>
-        <w:t xml:space="preserve"> script</w:t>
+        <w:t>Reglas para escribir un shell script</w:t>
       </w:r>
       <w:r>
         <w:rPr>
@@ -1023,15 +842,6 @@
         </w:rPr>
         <w:t xml:space="preserve">Use sangrías para separar las líneas del script, así será más fácil de leer. </w:t>
       </w:r>
-      <w:r>
-        <w:sym w:font="Symbol" w:char="F0A7"/>
-      </w:r>
-      <w:r>
-        <w:rPr>
-          <w:rFonts w:ascii="Arial" w:eastAsia="Arial" w:hAnsi="Arial" w:cs="Arial"/>
-        </w:rPr>
-        <w:t xml:space="preserve"> </w:t>
-      </w:r>
     </w:p>
     <w:p>
       <w:pPr>
@@ -1048,21 +858,7 @@
         <w:rPr>
           <w:rFonts w:ascii="Arial" w:eastAsia="Arial" w:hAnsi="Arial" w:cs="Arial"/>
         </w:rPr>
-        <w:t xml:space="preserve">El </w:t>
-      </w:r>
-      <w:proofErr w:type="spellStart"/>
-      <w:r>
-        <w:rPr>
-          <w:rFonts w:ascii="Arial" w:eastAsia="Arial" w:hAnsi="Arial" w:cs="Arial"/>
-        </w:rPr>
-        <w:t>enter</w:t>
-      </w:r>
-      <w:proofErr w:type="spellEnd"/>
-      <w:r>
-        <w:rPr>
-          <w:rFonts w:ascii="Arial" w:eastAsia="Arial" w:hAnsi="Arial" w:cs="Arial"/>
-        </w:rPr>
-        <w:t xml:space="preserve"> se considera el fin de comando. </w:t>
+        <w:t xml:space="preserve">El enter se considera el fin de comando. </w:t>
       </w:r>
     </w:p>
     <w:p>
@@ -1139,25 +935,7 @@
           <w:bCs/>
         </w:rPr>
         <w:lastRenderedPageBreak/>
-        <w:t xml:space="preserve">Pasos para la creación de un </w:t>
-      </w:r>
-      <w:proofErr w:type="spellStart"/>
-      <w:r>
-        <w:rPr>
-          <w:rFonts w:ascii="Arial" w:eastAsia="Arial" w:hAnsi="Arial" w:cs="Arial"/>
-          <w:b/>
-          <w:bCs/>
-        </w:rPr>
-        <w:t>shell</w:t>
-      </w:r>
-      <w:proofErr w:type="spellEnd"/>
-      <w:r>
-        <w:rPr>
-          <w:rFonts w:ascii="Arial" w:eastAsia="Arial" w:hAnsi="Arial" w:cs="Arial"/>
-          <w:b/>
-          <w:bCs/>
-        </w:rPr>
-        <w:t xml:space="preserve"> script</w:t>
+        <w:t>Pasos para la creación de un shell script</w:t>
       </w:r>
       <w:r>
         <w:rPr>
@@ -1181,21 +959,7 @@
         <w:rPr>
           <w:rFonts w:ascii="Arial" w:eastAsia="Arial" w:hAnsi="Arial" w:cs="Arial"/>
         </w:rPr>
-        <w:t xml:space="preserve">Generar el archivo de texto con un editor de texto como vi, nano, pico, </w:t>
-      </w:r>
-      <w:proofErr w:type="spellStart"/>
-      <w:r>
-        <w:rPr>
-          <w:rFonts w:ascii="Arial" w:eastAsia="Arial" w:hAnsi="Arial" w:cs="Arial"/>
-        </w:rPr>
-        <w:t>emacs</w:t>
-      </w:r>
-      <w:proofErr w:type="spellEnd"/>
-      <w:r>
-        <w:rPr>
-          <w:rFonts w:ascii="Arial" w:eastAsia="Arial" w:hAnsi="Arial" w:cs="Arial"/>
-        </w:rPr>
-        <w:t xml:space="preserve">, etc. </w:t>
+        <w:t xml:space="preserve">Generar el archivo de texto con un editor de texto como vi, nano, pico, emacs, etc. </w:t>
       </w:r>
     </w:p>
     <w:p>
@@ -1431,7 +1195,6 @@
           <w:rFonts w:ascii="Arial" w:eastAsia="Arial" w:hAnsi="Arial" w:cs="Arial"/>
         </w:rPr>
       </w:pPr>
-      <w:proofErr w:type="spellStart"/>
       <w:r>
         <w:rPr>
           <w:rFonts w:ascii="Arial" w:eastAsia="Arial" w:hAnsi="Arial" w:cs="Arial"/>
@@ -1440,7 +1203,6 @@
         </w:rPr>
         <w:t>read</w:t>
       </w:r>
-      <w:proofErr w:type="spellEnd"/>
       <w:r>
         <w:rPr>
           <w:rFonts w:ascii="Arial" w:eastAsia="Arial" w:hAnsi="Arial" w:cs="Arial"/>
@@ -1459,47 +1221,11 @@
           <w:rFonts w:ascii="Arial" w:eastAsia="Arial" w:hAnsi="Arial" w:cs="Arial"/>
         </w:rPr>
       </w:pPr>
-      <w:proofErr w:type="spellStart"/>
-      <w:r>
-        <w:rPr>
-          <w:rFonts w:ascii="Arial" w:eastAsia="Arial" w:hAnsi="Arial" w:cs="Arial"/>
-        </w:rPr>
-        <w:t>read</w:t>
-      </w:r>
-      <w:proofErr w:type="spellEnd"/>
-      <w:r>
-        <w:rPr>
-          <w:rFonts w:ascii="Arial" w:eastAsia="Arial" w:hAnsi="Arial" w:cs="Arial"/>
-        </w:rPr>
-        <w:t xml:space="preserve"> </w:t>
-      </w:r>
-      <w:proofErr w:type="spellStart"/>
-      <w:r>
-        <w:rPr>
-          <w:rFonts w:ascii="Arial" w:eastAsia="Arial" w:hAnsi="Arial" w:cs="Arial"/>
-        </w:rPr>
-        <w:t>varibale</w:t>
-      </w:r>
-      <w:proofErr w:type="spellEnd"/>
-      <w:r>
-        <w:rPr>
-          <w:rFonts w:ascii="Arial" w:eastAsia="Arial" w:hAnsi="Arial" w:cs="Arial"/>
-        </w:rPr>
-        <w:t xml:space="preserve"> -&gt; lee una </w:t>
-      </w:r>
-      <w:proofErr w:type="spellStart"/>
-      <w:r>
-        <w:rPr>
-          <w:rFonts w:ascii="Arial" w:eastAsia="Arial" w:hAnsi="Arial" w:cs="Arial"/>
-        </w:rPr>
-        <w:t>varibale</w:t>
-      </w:r>
-      <w:proofErr w:type="spellEnd"/>
-      <w:r>
-        <w:rPr>
-          <w:rFonts w:ascii="Arial" w:eastAsia="Arial" w:hAnsi="Arial" w:cs="Arial"/>
-        </w:rPr>
-        <w:t xml:space="preserve"> </w:t>
+      <w:r>
+        <w:rPr>
+          <w:rFonts w:ascii="Arial" w:eastAsia="Arial" w:hAnsi="Arial" w:cs="Arial"/>
+        </w:rPr>
+        <w:t xml:space="preserve">read varibale -&gt; lee una varibale </w:t>
       </w:r>
     </w:p>
     <w:p>
@@ -1513,53 +1239,17 @@
           <w:rFonts w:ascii="Arial" w:eastAsia="Arial" w:hAnsi="Arial" w:cs="Arial"/>
         </w:rPr>
       </w:pPr>
-      <w:proofErr w:type="spellStart"/>
-      <w:r>
-        <w:rPr>
-          <w:rFonts w:ascii="Arial" w:eastAsia="Arial" w:hAnsi="Arial" w:cs="Arial"/>
-        </w:rPr>
-        <w:t>read</w:t>
-      </w:r>
-      <w:proofErr w:type="spellEnd"/>
-      <w:r>
-        <w:rPr>
-          <w:rFonts w:ascii="Arial" w:eastAsia="Arial" w:hAnsi="Arial" w:cs="Arial"/>
-        </w:rPr>
-        <w:t xml:space="preserve"> varibales1 </w:t>
-      </w:r>
-      <w:proofErr w:type="spellStart"/>
-      <w:r>
-        <w:rPr>
-          <w:rFonts w:ascii="Arial" w:eastAsia="Arial" w:hAnsi="Arial" w:cs="Arial"/>
-        </w:rPr>
-        <w:t>varibale</w:t>
-      </w:r>
-      <w:proofErr w:type="spellEnd"/>
-      <w:r>
-        <w:rPr>
-          <w:rFonts w:ascii="Arial" w:eastAsia="Arial" w:hAnsi="Arial" w:cs="Arial"/>
-        </w:rPr>
-        <w:t xml:space="preserve"> 2 -&gt; lee dos </w:t>
-      </w:r>
-      <w:proofErr w:type="spellStart"/>
-      <w:r>
-        <w:rPr>
-          <w:rFonts w:ascii="Arial" w:eastAsia="Arial" w:hAnsi="Arial" w:cs="Arial"/>
-        </w:rPr>
-        <w:t>v</w:t>
-      </w:r>
-      <w:r>
-        <w:rPr>
-          <w:rFonts w:ascii="Arial" w:eastAsia="Arial" w:hAnsi="Arial" w:cs="Arial"/>
-        </w:rPr>
-        <w:t>aribales</w:t>
-      </w:r>
-      <w:proofErr w:type="spellEnd"/>
-      <w:r>
-        <w:rPr>
-          <w:rFonts w:ascii="Arial" w:eastAsia="Arial" w:hAnsi="Arial" w:cs="Arial"/>
-        </w:rPr>
-        <w:t xml:space="preserve"> </w:t>
+      <w:r>
+        <w:rPr>
+          <w:rFonts w:ascii="Arial" w:eastAsia="Arial" w:hAnsi="Arial" w:cs="Arial"/>
+        </w:rPr>
+        <w:t>read varibales1 varibale 2 -&gt; lee dos v</w:t>
+      </w:r>
+      <w:r>
+        <w:rPr>
+          <w:rFonts w:ascii="Arial" w:eastAsia="Arial" w:hAnsi="Arial" w:cs="Arial"/>
+        </w:rPr>
+        <w:t xml:space="preserve">aribales </w:t>
       </w:r>
     </w:p>
     <w:p>
@@ -1620,23 +1310,13 @@
           <w:bCs/>
         </w:rPr>
       </w:pPr>
-      <w:proofErr w:type="spellStart"/>
-      <w:r>
-        <w:rPr>
-          <w:rFonts w:ascii="Arial" w:eastAsia="Arial" w:hAnsi="Arial" w:cs="Arial"/>
-          <w:b/>
-          <w:bCs/>
-        </w:rPr>
-        <w:t>read</w:t>
-      </w:r>
-      <w:proofErr w:type="spellEnd"/>
-      <w:r>
-        <w:rPr>
-          <w:rFonts w:ascii="Arial" w:eastAsia="Arial" w:hAnsi="Arial" w:cs="Arial"/>
-          <w:b/>
-          <w:bCs/>
-        </w:rPr>
-        <w:t xml:space="preserve"> nombre echo </w:t>
+      <w:r>
+        <w:rPr>
+          <w:rFonts w:ascii="Arial" w:eastAsia="Arial" w:hAnsi="Arial" w:cs="Arial"/>
+          <w:b/>
+          <w:bCs/>
+        </w:rPr>
+        <w:t xml:space="preserve">read nombre echo </w:t>
       </w:r>
     </w:p>
     <w:p>
@@ -1658,25 +1338,7 @@
           <w:b/>
           <w:bCs/>
         </w:rPr>
-        <w:t>“</w:t>
-      </w:r>
-      <w:proofErr w:type="spellStart"/>
-      <w:r>
-        <w:rPr>
-          <w:rFonts w:ascii="Arial" w:eastAsia="Arial" w:hAnsi="Arial" w:cs="Arial"/>
-          <w:b/>
-          <w:bCs/>
-        </w:rPr>
-        <w:t>Cual</w:t>
-      </w:r>
-      <w:proofErr w:type="spellEnd"/>
-      <w:r>
-        <w:rPr>
-          <w:rFonts w:ascii="Arial" w:eastAsia="Arial" w:hAnsi="Arial" w:cs="Arial"/>
-          <w:b/>
-          <w:bCs/>
-        </w:rPr>
-        <w:t xml:space="preserve"> es tu nombre y matrícula?” </w:t>
+        <w:t xml:space="preserve">“Cual es tu nombre y matrícula?” </w:t>
       </w:r>
     </w:p>
     <w:p>
@@ -1689,23 +1351,13 @@
           <w:bCs/>
         </w:rPr>
       </w:pPr>
-      <w:proofErr w:type="spellStart"/>
-      <w:r>
-        <w:rPr>
-          <w:rFonts w:ascii="Arial" w:eastAsia="Arial" w:hAnsi="Arial" w:cs="Arial"/>
-          <w:b/>
-          <w:bCs/>
-        </w:rPr>
-        <w:t>read</w:t>
-      </w:r>
-      <w:proofErr w:type="spellEnd"/>
-      <w:r>
-        <w:rPr>
-          <w:rFonts w:ascii="Arial" w:eastAsia="Arial" w:hAnsi="Arial" w:cs="Arial"/>
-          <w:b/>
-          <w:bCs/>
-        </w:rPr>
-        <w:t xml:space="preserve"> nombre matricula</w:t>
+      <w:r>
+        <w:rPr>
+          <w:rFonts w:ascii="Arial" w:eastAsia="Arial" w:hAnsi="Arial" w:cs="Arial"/>
+          <w:b/>
+          <w:bCs/>
+        </w:rPr>
+        <w:t>read nombre matricula</w:t>
       </w:r>
     </w:p>
     <w:p>
@@ -1841,21 +1493,7 @@
         <w:rPr>
           <w:rFonts w:ascii="Arial" w:eastAsia="Arial" w:hAnsi="Arial" w:cs="Arial"/>
         </w:rPr>
-        <w:t xml:space="preserve">domicilio= “Calzada </w:t>
-      </w:r>
-      <w:proofErr w:type="spellStart"/>
-      <w:r>
-        <w:rPr>
-          <w:rFonts w:ascii="Arial" w:eastAsia="Arial" w:hAnsi="Arial" w:cs="Arial"/>
-        </w:rPr>
-        <w:t>Tecnologico</w:t>
-      </w:r>
-      <w:proofErr w:type="spellEnd"/>
-      <w:r>
-        <w:rPr>
-          <w:rFonts w:ascii="Arial" w:eastAsia="Arial" w:hAnsi="Arial" w:cs="Arial"/>
-        </w:rPr>
-        <w:t xml:space="preserve">” </w:t>
+        <w:t xml:space="preserve">domicilio= “Calzada Tecnologico” </w:t>
       </w:r>
     </w:p>
     <w:p>
@@ -2114,21 +1752,7 @@
         <w:rPr>
           <w:rFonts w:ascii="Arial" w:eastAsia="Arial" w:hAnsi="Arial" w:cs="Arial"/>
         </w:rPr>
-        <w:t xml:space="preserve">echo "El script en </w:t>
-      </w:r>
-      <w:proofErr w:type="spellStart"/>
-      <w:r>
-        <w:rPr>
-          <w:rFonts w:ascii="Arial" w:eastAsia="Arial" w:hAnsi="Arial" w:cs="Arial"/>
-        </w:rPr>
-        <w:t>ejecucion</w:t>
-      </w:r>
-      <w:proofErr w:type="spellEnd"/>
-      <w:r>
-        <w:rPr>
-          <w:rFonts w:ascii="Arial" w:eastAsia="Arial" w:hAnsi="Arial" w:cs="Arial"/>
-        </w:rPr>
-        <w:t xml:space="preserve"> es $0" </w:t>
+        <w:t xml:space="preserve">echo "El script en ejecucion es $0" </w:t>
       </w:r>
     </w:p>
     <w:p>
@@ -2171,62 +1795,20 @@
         <w:rPr>
           <w:rFonts w:ascii="Arial" w:eastAsia="Arial" w:hAnsi="Arial" w:cs="Arial"/>
         </w:rPr>
-        <w:t>$# :</w:t>
-      </w:r>
-      <w:proofErr w:type="spellStart"/>
-      <w:r>
-        <w:rPr>
-          <w:rFonts w:ascii="Arial" w:eastAsia="Arial" w:hAnsi="Arial" w:cs="Arial"/>
-        </w:rPr>
-        <w:t>num</w:t>
-      </w:r>
-      <w:proofErr w:type="spellEnd"/>
-      <w:r>
-        <w:rPr>
-          <w:rFonts w:ascii="Arial" w:eastAsia="Arial" w:hAnsi="Arial" w:cs="Arial"/>
-        </w:rPr>
-        <w:t xml:space="preserve">. de argumentos </w:t>
-      </w:r>
-    </w:p>
-    <w:p>
-      <w:pPr>
-        <w:rPr>
-          <w:rFonts w:ascii="Arial" w:eastAsia="Arial" w:hAnsi="Arial" w:cs="Arial"/>
-        </w:rPr>
-      </w:pPr>
-      <w:r>
-        <w:rPr>
-          <w:rFonts w:ascii="Arial" w:eastAsia="Arial" w:hAnsi="Arial" w:cs="Arial"/>
-        </w:rPr>
-        <w:t xml:space="preserve">$* :todos los </w:t>
-      </w:r>
-      <w:proofErr w:type="spellStart"/>
-      <w:r>
-        <w:rPr>
-          <w:rFonts w:ascii="Arial" w:eastAsia="Arial" w:hAnsi="Arial" w:cs="Arial"/>
-        </w:rPr>
-        <w:t>arg</w:t>
-      </w:r>
-      <w:proofErr w:type="spellEnd"/>
-      <w:r>
-        <w:rPr>
-          <w:rFonts w:ascii="Arial" w:eastAsia="Arial" w:hAnsi="Arial" w:cs="Arial"/>
-        </w:rPr>
-        <w:t xml:space="preserve"> de la </w:t>
-      </w:r>
-      <w:proofErr w:type="spellStart"/>
-      <w:r>
-        <w:rPr>
-          <w:rFonts w:ascii="Arial" w:eastAsia="Arial" w:hAnsi="Arial" w:cs="Arial"/>
-        </w:rPr>
-        <w:t>shell</w:t>
-      </w:r>
-      <w:proofErr w:type="spellEnd"/>
-      <w:r>
-        <w:rPr>
-          <w:rFonts w:ascii="Arial" w:eastAsia="Arial" w:hAnsi="Arial" w:cs="Arial"/>
-        </w:rPr>
-        <w:t xml:space="preserve"> </w:t>
+        <w:t xml:space="preserve">$# :num. de argumentos </w:t>
+      </w:r>
+    </w:p>
+    <w:p>
+      <w:pPr>
+        <w:rPr>
+          <w:rFonts w:ascii="Arial" w:eastAsia="Arial" w:hAnsi="Arial" w:cs="Arial"/>
+        </w:rPr>
+      </w:pPr>
+      <w:r>
+        <w:rPr>
+          <w:rFonts w:ascii="Arial" w:eastAsia="Arial" w:hAnsi="Arial" w:cs="Arial"/>
+        </w:rPr>
+        <w:t xml:space="preserve">$* :todos los arg de la shell </w:t>
       </w:r>
     </w:p>
     <w:p>
@@ -2300,21 +1882,7 @@
         <w:rPr>
           <w:rFonts w:ascii="Arial" w:eastAsia="Arial" w:hAnsi="Arial" w:cs="Arial"/>
         </w:rPr>
-        <w:t xml:space="preserve">La comilla invertida ` indica al </w:t>
-      </w:r>
-      <w:proofErr w:type="spellStart"/>
-      <w:r>
-        <w:rPr>
-          <w:rFonts w:ascii="Arial" w:eastAsia="Arial" w:hAnsi="Arial" w:cs="Arial"/>
-        </w:rPr>
-        <w:t>shell</w:t>
-      </w:r>
-      <w:proofErr w:type="spellEnd"/>
-      <w:r>
-        <w:rPr>
-          <w:rFonts w:ascii="Arial" w:eastAsia="Arial" w:hAnsi="Arial" w:cs="Arial"/>
-        </w:rPr>
-        <w:t xml:space="preserve"> que la cadena entrecomillada es un comando a ejecutarse, por ejemplo, en el siguiente script la variable fecha toma el valor que resulta de ejecutar el comando date, lo que se conoce como sustitución de comando.</w:t>
+        <w:t>La comilla invertida ` indica al shell que la cadena entrecomillada es un comando a ejecutarse, por ejemplo, en el siguiente script la variable fecha toma el valor que resulta de ejecutar el comando date, lo que se conoce como sustitución de comando.</w:t>
       </w:r>
     </w:p>
     <w:p>
@@ -2342,58 +1910,30 @@
           <w:bCs/>
         </w:rPr>
       </w:pPr>
-      <w:proofErr w:type="spellStart"/>
-      <w:r>
-        <w:rPr>
-          <w:rFonts w:ascii="Arial" w:eastAsia="Arial" w:hAnsi="Arial" w:cs="Arial"/>
-          <w:b/>
-          <w:bCs/>
-        </w:rPr>
-        <w:t>clear</w:t>
-      </w:r>
-      <w:proofErr w:type="spellEnd"/>
-      <w:r>
-        <w:rPr>
-          <w:rFonts w:ascii="Arial" w:eastAsia="Arial" w:hAnsi="Arial" w:cs="Arial"/>
-          <w:b/>
-          <w:bCs/>
-        </w:rPr>
-        <w:t xml:space="preserve"> </w:t>
-      </w:r>
-    </w:p>
-    <w:p>
-      <w:pPr>
-        <w:rPr>
-          <w:rFonts w:ascii="Arial" w:eastAsia="Arial" w:hAnsi="Arial" w:cs="Arial"/>
-          <w:b/>
-          <w:bCs/>
-        </w:rPr>
-      </w:pPr>
-      <w:r>
-        <w:rPr>
-          <w:rFonts w:ascii="Arial" w:eastAsia="Arial" w:hAnsi="Arial" w:cs="Arial"/>
-          <w:b/>
-          <w:bCs/>
-        </w:rPr>
-        <w:t>actual=`</w:t>
-      </w:r>
-      <w:proofErr w:type="spellStart"/>
-      <w:r>
-        <w:rPr>
-          <w:rFonts w:ascii="Arial" w:eastAsia="Arial" w:hAnsi="Arial" w:cs="Arial"/>
-          <w:b/>
-          <w:bCs/>
-        </w:rPr>
-        <w:t>pwd</w:t>
-      </w:r>
-      <w:proofErr w:type="spellEnd"/>
-      <w:r>
-        <w:rPr>
-          <w:rFonts w:ascii="Arial" w:eastAsia="Arial" w:hAnsi="Arial" w:cs="Arial"/>
-          <w:b/>
-          <w:bCs/>
-        </w:rPr>
-        <w:t xml:space="preserve">` </w:t>
+      <w:r>
+        <w:rPr>
+          <w:rFonts w:ascii="Arial" w:eastAsia="Arial" w:hAnsi="Arial" w:cs="Arial"/>
+          <w:b/>
+          <w:bCs/>
+        </w:rPr>
+        <w:t xml:space="preserve">clear </w:t>
+      </w:r>
+    </w:p>
+    <w:p>
+      <w:pPr>
+        <w:rPr>
+          <w:rFonts w:ascii="Arial" w:eastAsia="Arial" w:hAnsi="Arial" w:cs="Arial"/>
+          <w:b/>
+          <w:bCs/>
+        </w:rPr>
+      </w:pPr>
+      <w:r>
+        <w:rPr>
+          <w:rFonts w:ascii="Arial" w:eastAsia="Arial" w:hAnsi="Arial" w:cs="Arial"/>
+          <w:b/>
+          <w:bCs/>
+        </w:rPr>
+        <w:t xml:space="preserve">actual=`pwd` </w:t>
       </w:r>
     </w:p>
     <w:p>
@@ -2440,21 +1980,7 @@
         <w:rPr>
           <w:rFonts w:ascii="Arial" w:eastAsia="Arial" w:hAnsi="Arial" w:cs="Arial"/>
         </w:rPr>
-        <w:t xml:space="preserve">Los siguientes símbolos son considerados caracteres especiales dentro de los scripts para poderlos usarlos dentro en el comando echo, es necesario anteponerles la diagonal invertida o </w:t>
-      </w:r>
-      <w:proofErr w:type="spellStart"/>
-      <w:r>
-        <w:rPr>
-          <w:rFonts w:ascii="Arial" w:eastAsia="Arial" w:hAnsi="Arial" w:cs="Arial"/>
-        </w:rPr>
-        <w:t>backslash</w:t>
-      </w:r>
-      <w:proofErr w:type="spellEnd"/>
-      <w:r>
-        <w:rPr>
-          <w:rFonts w:ascii="Arial" w:eastAsia="Arial" w:hAnsi="Arial" w:cs="Arial"/>
-        </w:rPr>
-        <w:t xml:space="preserve"> [\]. </w:t>
+        <w:t xml:space="preserve">Los siguientes símbolos son considerados caracteres especiales dentro de los scripts para poderlos usarlos dentro en el comando echo, es necesario anteponerles la diagonal invertida o backslash [\]. </w:t>
       </w:r>
     </w:p>
     <w:p>
@@ -2526,21 +2052,7 @@
         <w:rPr>
           <w:rFonts w:ascii="Arial" w:eastAsia="Arial" w:hAnsi="Arial" w:cs="Arial"/>
         </w:rPr>
-        <w:t xml:space="preserve">&amp; Ejecución de un proceso en el </w:t>
-      </w:r>
-      <w:proofErr w:type="spellStart"/>
-      <w:r>
-        <w:rPr>
-          <w:rFonts w:ascii="Arial" w:eastAsia="Arial" w:hAnsi="Arial" w:cs="Arial"/>
-        </w:rPr>
-        <w:t>background</w:t>
-      </w:r>
-      <w:proofErr w:type="spellEnd"/>
-      <w:r>
-        <w:rPr>
-          <w:rFonts w:ascii="Arial" w:eastAsia="Arial" w:hAnsi="Arial" w:cs="Arial"/>
-        </w:rPr>
-        <w:t xml:space="preserve">. </w:t>
+        <w:t xml:space="preserve">&amp; Ejecución de un proceso en el background. </w:t>
       </w:r>
     </w:p>
     <w:p>
@@ -2558,21 +2070,7 @@
         <w:rPr>
           <w:rFonts w:ascii="Arial" w:eastAsia="Arial" w:hAnsi="Arial" w:cs="Arial"/>
         </w:rPr>
-        <w:t xml:space="preserve">? Comodín para un solo </w:t>
-      </w:r>
-      <w:proofErr w:type="spellStart"/>
-      <w:r>
-        <w:rPr>
-          <w:rFonts w:ascii="Arial" w:eastAsia="Arial" w:hAnsi="Arial" w:cs="Arial"/>
-        </w:rPr>
-        <w:t>caracter</w:t>
-      </w:r>
-      <w:proofErr w:type="spellEnd"/>
-      <w:r>
-        <w:rPr>
-          <w:rFonts w:ascii="Arial" w:eastAsia="Arial" w:hAnsi="Arial" w:cs="Arial"/>
-        </w:rPr>
-        <w:t xml:space="preserve">. </w:t>
+        <w:t xml:space="preserve">? Comodín para un solo caracter. </w:t>
       </w:r>
     </w:p>
     <w:p>
@@ -2698,56 +2196,24 @@
         <w:rPr>
           <w:rFonts w:ascii="Arial" w:eastAsia="Arial" w:hAnsi="Arial" w:cs="Arial"/>
         </w:rPr>
-        <w:t xml:space="preserve">[a-z] Caracteres de a </w:t>
-      </w:r>
-      <w:proofErr w:type="spellStart"/>
-      <w:r>
-        <w:rPr>
-          <w:rFonts w:ascii="Arial" w:eastAsia="Arial" w:hAnsi="Arial" w:cs="Arial"/>
-        </w:rPr>
-        <w:t>a</w:t>
-      </w:r>
-      <w:proofErr w:type="spellEnd"/>
-      <w:r>
-        <w:rPr>
-          <w:rFonts w:ascii="Arial" w:eastAsia="Arial" w:hAnsi="Arial" w:cs="Arial"/>
-        </w:rPr>
-        <w:t xml:space="preserve"> z.</w:t>
-      </w:r>
-    </w:p>
-    <w:p>
-      <w:pPr>
-        <w:rPr>
-          <w:rFonts w:ascii="Arial" w:eastAsia="Arial" w:hAnsi="Arial" w:cs="Arial"/>
-          <w:b/>
-          <w:bCs/>
-        </w:rPr>
-      </w:pPr>
-      <w:r>
-        <w:rPr>
-          <w:rFonts w:ascii="Arial" w:eastAsia="Arial" w:hAnsi="Arial" w:cs="Arial"/>
-          <w:b/>
-          <w:bCs/>
-        </w:rPr>
-        <w:t xml:space="preserve">Aspectos básicos del lenguaje </w:t>
-      </w:r>
-      <w:proofErr w:type="spellStart"/>
-      <w:r>
-        <w:rPr>
-          <w:rFonts w:ascii="Arial" w:eastAsia="Arial" w:hAnsi="Arial" w:cs="Arial"/>
-          <w:b/>
-          <w:bCs/>
-        </w:rPr>
-        <w:t>bash</w:t>
-      </w:r>
-      <w:proofErr w:type="spellEnd"/>
-      <w:r>
-        <w:rPr>
-          <w:rFonts w:ascii="Arial" w:eastAsia="Arial" w:hAnsi="Arial" w:cs="Arial"/>
-          <w:b/>
-          <w:bCs/>
-        </w:rPr>
-        <w:t xml:space="preserve"> </w:t>
+        <w:t>[a-z] Caracteres de a a z.</w:t>
+      </w:r>
+    </w:p>
+    <w:p>
+      <w:pPr>
+        <w:rPr>
+          <w:rFonts w:ascii="Arial" w:eastAsia="Arial" w:hAnsi="Arial" w:cs="Arial"/>
+          <w:b/>
+          <w:bCs/>
+        </w:rPr>
+      </w:pPr>
+      <w:r>
+        <w:rPr>
+          <w:rFonts w:ascii="Arial" w:eastAsia="Arial" w:hAnsi="Arial" w:cs="Arial"/>
+          <w:b/>
+          <w:bCs/>
+        </w:rPr>
+        <w:t xml:space="preserve">Aspectos básicos del lenguaje bash </w:t>
       </w:r>
     </w:p>
     <w:p>
@@ -2764,7 +2230,6 @@
         </w:rPr>
         <w:t xml:space="preserve">Bloques selectivos </w:t>
       </w:r>
-      <w:proofErr w:type="spellStart"/>
       <w:r>
         <w:rPr>
           <w:rFonts w:ascii="Arial" w:eastAsia="Arial" w:hAnsi="Arial" w:cs="Arial"/>
@@ -2773,10 +2238,11 @@
           <w:i/>
           <w:iCs/>
         </w:rPr>
-        <w:t>if-elseif-else</w:t>
-      </w:r>
-      <w:proofErr w:type="spellEnd"/>
-      <w:r>
+        <w:t xml:space="preserve">if-elseif-else , [], test. </w:t>
+      </w:r>
+    </w:p>
+    <w:p>
+      <w:pPr>
         <w:rPr>
           <w:rFonts w:ascii="Arial" w:eastAsia="Arial" w:hAnsi="Arial" w:cs="Arial"/>
           <w:b/>
@@ -2784,11 +2250,24 @@
           <w:i/>
           <w:iCs/>
         </w:rPr>
-        <w:t xml:space="preserve"> , [], test. </w:t>
-      </w:r>
-    </w:p>
-    <w:p>
-      <w:pPr>
+      </w:pPr>
+      <w:r>
+        <w:rPr>
+          <w:rFonts w:ascii="Arial" w:eastAsia="Arial" w:hAnsi="Arial" w:cs="Arial"/>
+          <w:b/>
+          <w:bCs/>
+        </w:rPr>
+        <w:t>Comandó</w:t>
+      </w:r>
+      <w:r>
+        <w:rPr>
+          <w:rFonts w:ascii="Arial" w:eastAsia="Arial" w:hAnsi="Arial" w:cs="Arial"/>
+          <w:b/>
+          <w:bCs/>
+        </w:rPr>
+        <w:t xml:space="preserve"> </w:t>
+      </w:r>
+      <w:r>
         <w:rPr>
           <w:rFonts w:ascii="Arial" w:eastAsia="Arial" w:hAnsi="Arial" w:cs="Arial"/>
           <w:b/>
@@ -2796,31 +2275,6 @@
           <w:i/>
           <w:iCs/>
         </w:rPr>
-      </w:pPr>
-      <w:r>
-        <w:rPr>
-          <w:rFonts w:ascii="Arial" w:eastAsia="Arial" w:hAnsi="Arial" w:cs="Arial"/>
-          <w:b/>
-          <w:bCs/>
-        </w:rPr>
-        <w:t>Comandó</w:t>
-      </w:r>
-      <w:r>
-        <w:rPr>
-          <w:rFonts w:ascii="Arial" w:eastAsia="Arial" w:hAnsi="Arial" w:cs="Arial"/>
-          <w:b/>
-          <w:bCs/>
-        </w:rPr>
-        <w:t xml:space="preserve"> </w:t>
-      </w:r>
-      <w:r>
-        <w:rPr>
-          <w:rFonts w:ascii="Arial" w:eastAsia="Arial" w:hAnsi="Arial" w:cs="Arial"/>
-          <w:b/>
-          <w:bCs/>
-          <w:i/>
-          <w:iCs/>
-        </w:rPr>
         <w:t>test o []</w:t>
       </w:r>
     </w:p>
@@ -2837,23 +2291,13 @@
         </w:rPr>
         <w:t xml:space="preserve">Los corchetes o </w:t>
       </w:r>
-      <w:proofErr w:type="spellStart"/>
-      <w:r>
-        <w:rPr>
-          <w:rFonts w:ascii="Arial" w:eastAsia="Arial" w:hAnsi="Arial" w:cs="Arial"/>
-          <w:b/>
-          <w:bCs/>
-        </w:rPr>
-        <w:t>tetst</w:t>
-      </w:r>
-      <w:proofErr w:type="spellEnd"/>
-      <w:r>
-        <w:rPr>
-          <w:rFonts w:ascii="Arial" w:eastAsia="Arial" w:hAnsi="Arial" w:cs="Arial"/>
-          <w:b/>
-          <w:bCs/>
-        </w:rPr>
-        <w:t xml:space="preserve"> </w:t>
+      <w:r>
+        <w:rPr>
+          <w:rFonts w:ascii="Arial" w:eastAsia="Arial" w:hAnsi="Arial" w:cs="Arial"/>
+          <w:b/>
+          <w:bCs/>
+        </w:rPr>
+        <w:t xml:space="preserve">tetst </w:t>
       </w:r>
       <w:r>
         <w:rPr>
@@ -2862,31 +2306,13 @@
         </w:rPr>
         <w:t xml:space="preserve">se usan para probar expresiones. </w:t>
       </w:r>
-      <w:proofErr w:type="spellStart"/>
-      <w:r>
-        <w:rPr>
-          <w:rFonts w:ascii="Arial" w:eastAsia="Arial" w:hAnsi="Arial" w:cs="Arial"/>
-          <w:bCs/>
-        </w:rPr>
-        <w:t>Comunmnet</w:t>
-      </w:r>
-      <w:proofErr w:type="spellEnd"/>
-      <w:r>
-        <w:rPr>
-          <w:rFonts w:ascii="Arial" w:eastAsia="Arial" w:hAnsi="Arial" w:cs="Arial"/>
-          <w:bCs/>
-        </w:rPr>
-        <w:t xml:space="preserve"> usadas en los bloquees selectivos de </w:t>
-      </w:r>
-      <w:proofErr w:type="spellStart"/>
-      <w:r>
-        <w:rPr>
-          <w:rFonts w:ascii="Arial" w:eastAsia="Arial" w:hAnsi="Arial" w:cs="Arial"/>
-          <w:bCs/>
-        </w:rPr>
-        <w:t>if-elseif-else</w:t>
-      </w:r>
-      <w:proofErr w:type="spellEnd"/>
+      <w:r>
+        <w:rPr>
+          <w:rFonts w:ascii="Arial" w:eastAsia="Arial" w:hAnsi="Arial" w:cs="Arial"/>
+          <w:bCs/>
+        </w:rPr>
+        <w:t>Comunmnet usadas en los bloquees selectivos de if-elseif-else</w:t>
+      </w:r>
     </w:p>
     <w:p>
       <w:pPr>
@@ -2910,37 +2336,12 @@
           <w:bCs/>
         </w:rPr>
       </w:pPr>
-      <w:proofErr w:type="spellStart"/>
-      <w:r>
-        <w:rPr>
-          <w:rFonts w:ascii="Arial" w:eastAsia="Arial" w:hAnsi="Arial" w:cs="Arial"/>
-          <w:bCs/>
-        </w:rPr>
-        <w:t>if</w:t>
-      </w:r>
-      <w:proofErr w:type="spellEnd"/>
-      <w:r>
-        <w:rPr>
-          <w:rFonts w:ascii="Arial" w:eastAsia="Arial" w:hAnsi="Arial" w:cs="Arial"/>
-          <w:bCs/>
-        </w:rPr>
-        <w:t xml:space="preserve"> [ expresión ]; </w:t>
-      </w:r>
-      <w:proofErr w:type="spellStart"/>
-      <w:r>
-        <w:rPr>
-          <w:rFonts w:ascii="Arial" w:eastAsia="Arial" w:hAnsi="Arial" w:cs="Arial"/>
-          <w:bCs/>
-        </w:rPr>
-        <w:t>then</w:t>
-      </w:r>
-      <w:proofErr w:type="spellEnd"/>
-      <w:r>
-        <w:rPr>
-          <w:rFonts w:ascii="Arial" w:eastAsia="Arial" w:hAnsi="Arial" w:cs="Arial"/>
-          <w:bCs/>
-        </w:rPr>
-        <w:t xml:space="preserve"> </w:t>
+      <w:r>
+        <w:rPr>
+          <w:rFonts w:ascii="Arial" w:eastAsia="Arial" w:hAnsi="Arial" w:cs="Arial"/>
+          <w:bCs/>
+        </w:rPr>
+        <w:t xml:space="preserve">if [ expresión ]; then </w:t>
       </w:r>
     </w:p>
     <w:p>
@@ -3006,30 +2407,201 @@
           <w:bCs/>
           <w:lang w:val="en-US"/>
         </w:rPr>
-        <w:t xml:space="preserve">if test </w:t>
-      </w:r>
-      <w:proofErr w:type="spellStart"/>
-      <w:r>
+        <w:t>if test expresión; then</w:t>
+      </w:r>
+    </w:p>
+    <w:p>
+      <w:pPr>
+        <w:ind w:firstLine="360"/>
+        <w:rPr>
+          <w:rFonts w:ascii="Arial" w:eastAsia="Arial" w:hAnsi="Arial" w:cs="Arial"/>
+          <w:bCs/>
+        </w:rPr>
+      </w:pPr>
+      <w:r>
+        <w:rPr>
+          <w:rFonts w:ascii="Arial" w:eastAsia="Arial" w:hAnsi="Arial" w:cs="Arial"/>
+          <w:bCs/>
+        </w:rPr>
+        <w:t xml:space="preserve">operaciones </w:t>
+      </w:r>
+    </w:p>
+    <w:p>
+      <w:pPr>
+        <w:rPr>
+          <w:rFonts w:ascii="Arial" w:eastAsia="Arial" w:hAnsi="Arial" w:cs="Arial"/>
+          <w:bCs/>
+        </w:rPr>
+      </w:pPr>
+      <w:r>
+        <w:rPr>
+          <w:rFonts w:ascii="Arial" w:eastAsia="Arial" w:hAnsi="Arial" w:cs="Arial"/>
+          <w:bCs/>
+        </w:rPr>
+        <w:t>fi</w:t>
+      </w:r>
+    </w:p>
+    <w:p>
+      <w:pPr>
+        <w:rPr>
+          <w:rFonts w:ascii="Arial" w:eastAsia="Arial" w:hAnsi="Arial" w:cs="Arial"/>
+          <w:bCs/>
+        </w:rPr>
+      </w:pPr>
+      <w:r>
+        <w:rPr>
+          <w:rFonts w:ascii="Arial" w:eastAsia="Arial" w:hAnsi="Arial" w:cs="Arial"/>
+          <w:bCs/>
+        </w:rPr>
+        <w:t>Se ejecutará una acción si la expresión de prueba es verdadera. Si no se ejecutarán las operaciones de la parte falsa (else).</w:t>
+      </w:r>
+    </w:p>
+    <w:p>
+      <w:pPr>
+        <w:rPr>
+          <w:rFonts w:ascii="Arial" w:eastAsia="Arial" w:hAnsi="Arial" w:cs="Arial"/>
+          <w:bCs/>
+        </w:rPr>
+      </w:pPr>
+      <w:r>
+        <w:rPr>
+          <w:rFonts w:ascii="Arial" w:eastAsia="Arial" w:hAnsi="Arial" w:cs="Arial"/>
+          <w:b/>
+        </w:rPr>
+        <w:t>Con []</w:t>
+      </w:r>
+      <w:r>
+        <w:rPr>
+          <w:rFonts w:ascii="Arial" w:eastAsia="Arial" w:hAnsi="Arial" w:cs="Arial"/>
+          <w:bCs/>
+        </w:rPr>
+        <w:t xml:space="preserve"> </w:t>
+      </w:r>
+    </w:p>
+    <w:p>
+      <w:pPr>
+        <w:rPr>
+          <w:rFonts w:ascii="Arial" w:eastAsia="Arial" w:hAnsi="Arial" w:cs="Arial"/>
+          <w:bCs/>
+        </w:rPr>
+      </w:pPr>
+      <w:r>
+        <w:rPr>
+          <w:rFonts w:ascii="Arial" w:eastAsia="Arial" w:hAnsi="Arial" w:cs="Arial"/>
+          <w:bCs/>
+        </w:rPr>
+        <w:t xml:space="preserve">if [ expresión ]; then </w:t>
+      </w:r>
+    </w:p>
+    <w:p>
+      <w:pPr>
+        <w:ind w:firstLine="708"/>
+        <w:rPr>
+          <w:rFonts w:ascii="Arial" w:eastAsia="Arial" w:hAnsi="Arial" w:cs="Arial"/>
+          <w:bCs/>
+        </w:rPr>
+      </w:pPr>
+      <w:r>
+        <w:rPr>
+          <w:rFonts w:ascii="Arial" w:eastAsia="Arial" w:hAnsi="Arial" w:cs="Arial"/>
+          <w:bCs/>
+        </w:rPr>
+        <w:t xml:space="preserve">operaciones </w:t>
+      </w:r>
+    </w:p>
+    <w:p>
+      <w:pPr>
+        <w:rPr>
+          <w:rFonts w:ascii="Arial" w:eastAsia="Arial" w:hAnsi="Arial" w:cs="Arial"/>
+          <w:bCs/>
+        </w:rPr>
+      </w:pPr>
+      <w:r>
+        <w:rPr>
+          <w:rFonts w:ascii="Arial" w:eastAsia="Arial" w:hAnsi="Arial" w:cs="Arial"/>
+          <w:bCs/>
+        </w:rPr>
+        <w:t xml:space="preserve">else </w:t>
+      </w:r>
+    </w:p>
+    <w:p>
+      <w:pPr>
+        <w:ind w:firstLine="708"/>
+        <w:rPr>
+          <w:rFonts w:ascii="Arial" w:eastAsia="Arial" w:hAnsi="Arial" w:cs="Arial"/>
+          <w:bCs/>
+        </w:rPr>
+      </w:pPr>
+      <w:r>
+        <w:rPr>
+          <w:rFonts w:ascii="Arial" w:eastAsia="Arial" w:hAnsi="Arial" w:cs="Arial"/>
+          <w:bCs/>
+        </w:rPr>
+        <w:t xml:space="preserve">operaciones </w:t>
+      </w:r>
+    </w:p>
+    <w:p>
+      <w:pPr>
         <w:rPr>
           <w:rFonts w:ascii="Arial" w:eastAsia="Arial" w:hAnsi="Arial" w:cs="Arial"/>
           <w:bCs/>
           <w:lang w:val="en-US"/>
         </w:rPr>
-        <w:t>expresión</w:t>
-      </w:r>
-      <w:proofErr w:type="spellEnd"/>
+      </w:pPr>
       <w:r>
         <w:rPr>
           <w:rFonts w:ascii="Arial" w:eastAsia="Arial" w:hAnsi="Arial" w:cs="Arial"/>
           <w:bCs/>
           <w:lang w:val="en-US"/>
         </w:rPr>
-        <w:t>; then</w:t>
-      </w:r>
-    </w:p>
-    <w:p>
-      <w:pPr>
-        <w:ind w:firstLine="360"/>
+        <w:t xml:space="preserve">fi </w:t>
+      </w:r>
+    </w:p>
+    <w:p>
+      <w:pPr>
+        <w:rPr>
+          <w:rFonts w:ascii="Arial" w:eastAsia="Arial" w:hAnsi="Arial" w:cs="Arial"/>
+          <w:bCs/>
+          <w:lang w:val="en-US"/>
+        </w:rPr>
+      </w:pPr>
+      <w:r>
+        <w:rPr>
+          <w:rFonts w:ascii="Arial" w:eastAsia="Arial" w:hAnsi="Arial" w:cs="Arial"/>
+          <w:b/>
+          <w:lang w:val="en-US"/>
+        </w:rPr>
+        <w:t>Con test</w:t>
+      </w:r>
+      <w:r>
+        <w:rPr>
+          <w:rFonts w:ascii="Arial" w:eastAsia="Arial" w:hAnsi="Arial" w:cs="Arial"/>
+          <w:bCs/>
+          <w:lang w:val="en-US"/>
+        </w:rPr>
+        <w:t xml:space="preserve"> </w:t>
+      </w:r>
+    </w:p>
+    <w:p>
+      <w:pPr>
+        <w:rPr>
+          <w:rFonts w:ascii="Arial" w:eastAsia="Arial" w:hAnsi="Arial" w:cs="Arial"/>
+          <w:bCs/>
+          <w:lang w:val="en-US"/>
+        </w:rPr>
+      </w:pPr>
+      <w:r>
+        <w:rPr>
+          <w:rFonts w:ascii="Arial" w:eastAsia="Arial" w:hAnsi="Arial" w:cs="Arial"/>
+          <w:bCs/>
+          <w:lang w:val="en-US"/>
+        </w:rPr>
+        <w:t xml:space="preserve">if test expresión; then </w:t>
+      </w:r>
+    </w:p>
+    <w:p>
+      <w:pPr>
+        <w:ind w:firstLine="708"/>
         <w:rPr>
           <w:rFonts w:ascii="Arial" w:eastAsia="Arial" w:hAnsi="Arial" w:cs="Arial"/>
           <w:bCs/>
@@ -3055,100 +2627,7 @@
           <w:rFonts w:ascii="Arial" w:eastAsia="Arial" w:hAnsi="Arial" w:cs="Arial"/>
           <w:bCs/>
         </w:rPr>
-        <w:t>fi</w:t>
-      </w:r>
-    </w:p>
-    <w:p>
-      <w:pPr>
-        <w:rPr>
-          <w:rFonts w:ascii="Arial" w:eastAsia="Arial" w:hAnsi="Arial" w:cs="Arial"/>
-          <w:bCs/>
-        </w:rPr>
-      </w:pPr>
-      <w:r>
-        <w:rPr>
-          <w:rFonts w:ascii="Arial" w:eastAsia="Arial" w:hAnsi="Arial" w:cs="Arial"/>
-          <w:bCs/>
-        </w:rPr>
-        <w:t>Se ejecutará una acción si la expresión de prueba es verdadera. Si no se ejecutarán las operaciones de la parte falsa (</w:t>
-      </w:r>
-      <w:proofErr w:type="spellStart"/>
-      <w:r>
-        <w:rPr>
-          <w:rFonts w:ascii="Arial" w:eastAsia="Arial" w:hAnsi="Arial" w:cs="Arial"/>
-          <w:bCs/>
-        </w:rPr>
-        <w:t>else</w:t>
-      </w:r>
-      <w:proofErr w:type="spellEnd"/>
-      <w:r>
-        <w:rPr>
-          <w:rFonts w:ascii="Arial" w:eastAsia="Arial" w:hAnsi="Arial" w:cs="Arial"/>
-          <w:bCs/>
-        </w:rPr>
-        <w:t>).</w:t>
-      </w:r>
-    </w:p>
-    <w:p>
-      <w:pPr>
-        <w:rPr>
-          <w:rFonts w:ascii="Arial" w:eastAsia="Arial" w:hAnsi="Arial" w:cs="Arial"/>
-          <w:bCs/>
-        </w:rPr>
-      </w:pPr>
-      <w:r>
-        <w:rPr>
-          <w:rFonts w:ascii="Arial" w:eastAsia="Arial" w:hAnsi="Arial" w:cs="Arial"/>
-          <w:b/>
-        </w:rPr>
-        <w:t>Con []</w:t>
-      </w:r>
-      <w:r>
-        <w:rPr>
-          <w:rFonts w:ascii="Arial" w:eastAsia="Arial" w:hAnsi="Arial" w:cs="Arial"/>
-          <w:bCs/>
-        </w:rPr>
-        <w:t xml:space="preserve"> </w:t>
-      </w:r>
-    </w:p>
-    <w:p>
-      <w:pPr>
-        <w:rPr>
-          <w:rFonts w:ascii="Arial" w:eastAsia="Arial" w:hAnsi="Arial" w:cs="Arial"/>
-          <w:bCs/>
-        </w:rPr>
-      </w:pPr>
-      <w:proofErr w:type="spellStart"/>
-      <w:r>
-        <w:rPr>
-          <w:rFonts w:ascii="Arial" w:eastAsia="Arial" w:hAnsi="Arial" w:cs="Arial"/>
-          <w:bCs/>
-        </w:rPr>
-        <w:t>if</w:t>
-      </w:r>
-      <w:proofErr w:type="spellEnd"/>
-      <w:r>
-        <w:rPr>
-          <w:rFonts w:ascii="Arial" w:eastAsia="Arial" w:hAnsi="Arial" w:cs="Arial"/>
-          <w:bCs/>
-        </w:rPr>
-        <w:t xml:space="preserve"> [ expresión ]; </w:t>
-      </w:r>
-      <w:proofErr w:type="spellStart"/>
-      <w:r>
-        <w:rPr>
-          <w:rFonts w:ascii="Arial" w:eastAsia="Arial" w:hAnsi="Arial" w:cs="Arial"/>
-          <w:bCs/>
-        </w:rPr>
-        <w:t>then</w:t>
-      </w:r>
-      <w:proofErr w:type="spellEnd"/>
-      <w:r>
-        <w:rPr>
-          <w:rFonts w:ascii="Arial" w:eastAsia="Arial" w:hAnsi="Arial" w:cs="Arial"/>
-          <w:bCs/>
-        </w:rPr>
-        <w:t xml:space="preserve"> </w:t>
+        <w:t xml:space="preserve">else </w:t>
       </w:r>
     </w:p>
     <w:p>
@@ -3174,21 +2653,44 @@
           <w:bCs/>
         </w:rPr>
       </w:pPr>
-      <w:proofErr w:type="spellStart"/>
-      <w:r>
-        <w:rPr>
-          <w:rFonts w:ascii="Arial" w:eastAsia="Arial" w:hAnsi="Arial" w:cs="Arial"/>
-          <w:bCs/>
-        </w:rPr>
-        <w:t>else</w:t>
-      </w:r>
-      <w:proofErr w:type="spellEnd"/>
-      <w:r>
-        <w:rPr>
-          <w:rFonts w:ascii="Arial" w:eastAsia="Arial" w:hAnsi="Arial" w:cs="Arial"/>
-          <w:bCs/>
-        </w:rPr>
-        <w:t xml:space="preserve"> </w:t>
+      <w:r>
+        <w:rPr>
+          <w:rFonts w:ascii="Arial" w:eastAsia="Arial" w:hAnsi="Arial" w:cs="Arial"/>
+          <w:bCs/>
+        </w:rPr>
+        <w:t xml:space="preserve">fi </w:t>
+      </w:r>
+    </w:p>
+    <w:p>
+      <w:pPr>
+        <w:rPr>
+          <w:rFonts w:ascii="Arial" w:eastAsia="Arial" w:hAnsi="Arial" w:cs="Arial"/>
+          <w:bCs/>
+        </w:rPr>
+      </w:pPr>
+      <w:r>
+        <w:rPr>
+          <w:rFonts w:ascii="Arial" w:eastAsia="Arial" w:hAnsi="Arial" w:cs="Arial"/>
+          <w:bCs/>
+        </w:rPr>
+        <w:t xml:space="preserve">La siguiente estructura del if permite anidar estructuras if, para permitir la selección de múltiples alternativas. Utiliza el comando elif, el cual prueba la variable de nuevo si el primer if no fue verdadero. Si ninguna de las pruebas es verdadero, entonces se ejecuta la parte falsa del elif. </w:t>
+      </w:r>
+    </w:p>
+    <w:p>
+      <w:pPr>
+        <w:rPr>
+          <w:rFonts w:ascii="Arial" w:eastAsia="Arial" w:hAnsi="Arial" w:cs="Arial"/>
+          <w:bCs/>
+          <w:lang w:val="en-US"/>
+        </w:rPr>
+      </w:pPr>
+      <w:r>
+        <w:rPr>
+          <w:rFonts w:ascii="Arial" w:eastAsia="Arial" w:hAnsi="Arial" w:cs="Arial"/>
+          <w:bCs/>
+          <w:lang w:val="en-US"/>
+        </w:rPr>
+        <w:t xml:space="preserve">if [ expresión ]; then </w:t>
       </w:r>
     </w:p>
     <w:p>
@@ -3197,12 +2699,14 @@
         <w:rPr>
           <w:rFonts w:ascii="Arial" w:eastAsia="Arial" w:hAnsi="Arial" w:cs="Arial"/>
           <w:bCs/>
-        </w:rPr>
-      </w:pPr>
-      <w:r>
-        <w:rPr>
-          <w:rFonts w:ascii="Arial" w:eastAsia="Arial" w:hAnsi="Arial" w:cs="Arial"/>
-          <w:bCs/>
+          <w:lang w:val="en-US"/>
+        </w:rPr>
+      </w:pPr>
+      <w:r>
+        <w:rPr>
+          <w:rFonts w:ascii="Arial" w:eastAsia="Arial" w:hAnsi="Arial" w:cs="Arial"/>
+          <w:bCs/>
+          <w:lang w:val="en-US"/>
         </w:rPr>
         <w:t xml:space="preserve">operaciones </w:t>
       </w:r>
@@ -3221,67 +2725,7 @@
           <w:bCs/>
           <w:lang w:val="en-US"/>
         </w:rPr>
-        <w:t xml:space="preserve">fi </w:t>
-      </w:r>
-    </w:p>
-    <w:p>
-      <w:pPr>
-        <w:rPr>
-          <w:rFonts w:ascii="Arial" w:eastAsia="Arial" w:hAnsi="Arial" w:cs="Arial"/>
-          <w:bCs/>
-          <w:lang w:val="en-US"/>
-        </w:rPr>
-      </w:pPr>
-      <w:r>
-        <w:rPr>
-          <w:rFonts w:ascii="Arial" w:eastAsia="Arial" w:hAnsi="Arial" w:cs="Arial"/>
-          <w:b/>
-          <w:lang w:val="en-US"/>
-        </w:rPr>
-        <w:t>Con test</w:t>
-      </w:r>
-      <w:r>
-        <w:rPr>
-          <w:rFonts w:ascii="Arial" w:eastAsia="Arial" w:hAnsi="Arial" w:cs="Arial"/>
-          <w:bCs/>
-          <w:lang w:val="en-US"/>
-        </w:rPr>
-        <w:t xml:space="preserve"> </w:t>
-      </w:r>
-    </w:p>
-    <w:p>
-      <w:pPr>
-        <w:rPr>
-          <w:rFonts w:ascii="Arial" w:eastAsia="Arial" w:hAnsi="Arial" w:cs="Arial"/>
-          <w:bCs/>
-          <w:lang w:val="en-US"/>
-        </w:rPr>
-      </w:pPr>
-      <w:r>
-        <w:rPr>
-          <w:rFonts w:ascii="Arial" w:eastAsia="Arial" w:hAnsi="Arial" w:cs="Arial"/>
-          <w:bCs/>
-          <w:lang w:val="en-US"/>
-        </w:rPr>
-        <w:t xml:space="preserve">if test </w:t>
-      </w:r>
-      <w:proofErr w:type="spellStart"/>
-      <w:r>
-        <w:rPr>
-          <w:rFonts w:ascii="Arial" w:eastAsia="Arial" w:hAnsi="Arial" w:cs="Arial"/>
-          <w:bCs/>
-          <w:lang w:val="en-US"/>
-        </w:rPr>
-        <w:t>expresión</w:t>
-      </w:r>
-      <w:proofErr w:type="spellEnd"/>
-      <w:r>
-        <w:rPr>
-          <w:rFonts w:ascii="Arial" w:eastAsia="Arial" w:hAnsi="Arial" w:cs="Arial"/>
-          <w:bCs/>
-          <w:lang w:val="en-US"/>
-        </w:rPr>
-        <w:t xml:space="preserve">; then </w:t>
+        <w:t xml:space="preserve">elseif [ expresion ]; then </w:t>
       </w:r>
     </w:p>
     <w:p>
@@ -3307,285 +2751,12 @@
           <w:bCs/>
         </w:rPr>
       </w:pPr>
-      <w:proofErr w:type="spellStart"/>
-      <w:r>
-        <w:rPr>
-          <w:rFonts w:ascii="Arial" w:eastAsia="Arial" w:hAnsi="Arial" w:cs="Arial"/>
-          <w:bCs/>
-        </w:rPr>
-        <w:t>else</w:t>
-      </w:r>
-      <w:proofErr w:type="spellEnd"/>
-      <w:r>
-        <w:rPr>
-          <w:rFonts w:ascii="Arial" w:eastAsia="Arial" w:hAnsi="Arial" w:cs="Arial"/>
-          <w:bCs/>
-        </w:rPr>
-        <w:t xml:space="preserve"> </w:t>
-      </w:r>
-    </w:p>
-    <w:p>
-      <w:pPr>
-        <w:ind w:firstLine="708"/>
-        <w:rPr>
-          <w:rFonts w:ascii="Arial" w:eastAsia="Arial" w:hAnsi="Arial" w:cs="Arial"/>
-          <w:bCs/>
-        </w:rPr>
-      </w:pPr>
-      <w:r>
-        <w:rPr>
-          <w:rFonts w:ascii="Arial" w:eastAsia="Arial" w:hAnsi="Arial" w:cs="Arial"/>
-          <w:bCs/>
-        </w:rPr>
-        <w:t xml:space="preserve">operaciones </w:t>
-      </w:r>
-    </w:p>
-    <w:p>
-      <w:pPr>
-        <w:rPr>
-          <w:rFonts w:ascii="Arial" w:eastAsia="Arial" w:hAnsi="Arial" w:cs="Arial"/>
-          <w:bCs/>
-        </w:rPr>
-      </w:pPr>
-      <w:r>
-        <w:rPr>
-          <w:rFonts w:ascii="Arial" w:eastAsia="Arial" w:hAnsi="Arial" w:cs="Arial"/>
-          <w:bCs/>
-        </w:rPr>
-        <w:t xml:space="preserve">fi </w:t>
-      </w:r>
-    </w:p>
-    <w:p>
-      <w:pPr>
-        <w:rPr>
-          <w:rFonts w:ascii="Arial" w:eastAsia="Arial" w:hAnsi="Arial" w:cs="Arial"/>
-          <w:bCs/>
-        </w:rPr>
-      </w:pPr>
-      <w:r>
-        <w:rPr>
-          <w:rFonts w:ascii="Arial" w:eastAsia="Arial" w:hAnsi="Arial" w:cs="Arial"/>
-          <w:bCs/>
-        </w:rPr>
-        <w:t xml:space="preserve">La siguiente estructura del </w:t>
-      </w:r>
-      <w:proofErr w:type="spellStart"/>
-      <w:r>
-        <w:rPr>
-          <w:rFonts w:ascii="Arial" w:eastAsia="Arial" w:hAnsi="Arial" w:cs="Arial"/>
-          <w:bCs/>
-        </w:rPr>
-        <w:t>if</w:t>
-      </w:r>
-      <w:proofErr w:type="spellEnd"/>
-      <w:r>
-        <w:rPr>
-          <w:rFonts w:ascii="Arial" w:eastAsia="Arial" w:hAnsi="Arial" w:cs="Arial"/>
-          <w:bCs/>
-        </w:rPr>
-        <w:t xml:space="preserve"> permite anidar estructuras </w:t>
-      </w:r>
-      <w:proofErr w:type="spellStart"/>
-      <w:r>
-        <w:rPr>
-          <w:rFonts w:ascii="Arial" w:eastAsia="Arial" w:hAnsi="Arial" w:cs="Arial"/>
-          <w:bCs/>
-        </w:rPr>
-        <w:t>if</w:t>
-      </w:r>
-      <w:proofErr w:type="spellEnd"/>
-      <w:r>
-        <w:rPr>
-          <w:rFonts w:ascii="Arial" w:eastAsia="Arial" w:hAnsi="Arial" w:cs="Arial"/>
-          <w:bCs/>
-        </w:rPr>
-        <w:t xml:space="preserve">, para permitir la selección de múltiples alternativas. Utiliza el comando </w:t>
-      </w:r>
-      <w:proofErr w:type="spellStart"/>
-      <w:r>
-        <w:rPr>
-          <w:rFonts w:ascii="Arial" w:eastAsia="Arial" w:hAnsi="Arial" w:cs="Arial"/>
-          <w:bCs/>
-        </w:rPr>
-        <w:t>elif</w:t>
-      </w:r>
-      <w:proofErr w:type="spellEnd"/>
-      <w:r>
-        <w:rPr>
-          <w:rFonts w:ascii="Arial" w:eastAsia="Arial" w:hAnsi="Arial" w:cs="Arial"/>
-          <w:bCs/>
-        </w:rPr>
-        <w:t xml:space="preserve">, el cual prueba la variable de nuevo si el primer </w:t>
-      </w:r>
-      <w:proofErr w:type="spellStart"/>
-      <w:r>
-        <w:rPr>
-          <w:rFonts w:ascii="Arial" w:eastAsia="Arial" w:hAnsi="Arial" w:cs="Arial"/>
-          <w:bCs/>
-        </w:rPr>
-        <w:t>if</w:t>
-      </w:r>
-      <w:proofErr w:type="spellEnd"/>
-      <w:r>
-        <w:rPr>
-          <w:rFonts w:ascii="Arial" w:eastAsia="Arial" w:hAnsi="Arial" w:cs="Arial"/>
-          <w:bCs/>
-        </w:rPr>
-        <w:t xml:space="preserve"> no fue verdadero. Si ninguna de las pruebas es verdadero, entonces se ejecuta la parte falsa del </w:t>
-      </w:r>
-      <w:proofErr w:type="spellStart"/>
-      <w:r>
-        <w:rPr>
-          <w:rFonts w:ascii="Arial" w:eastAsia="Arial" w:hAnsi="Arial" w:cs="Arial"/>
-          <w:bCs/>
-        </w:rPr>
-        <w:t>elif</w:t>
-      </w:r>
-      <w:proofErr w:type="spellEnd"/>
-      <w:r>
-        <w:rPr>
-          <w:rFonts w:ascii="Arial" w:eastAsia="Arial" w:hAnsi="Arial" w:cs="Arial"/>
-          <w:bCs/>
-        </w:rPr>
-        <w:t xml:space="preserve">. </w:t>
-      </w:r>
-    </w:p>
-    <w:p>
-      <w:pPr>
-        <w:rPr>
-          <w:rFonts w:ascii="Arial" w:eastAsia="Arial" w:hAnsi="Arial" w:cs="Arial"/>
-          <w:bCs/>
-          <w:lang w:val="en-US"/>
-        </w:rPr>
-      </w:pPr>
-      <w:r>
-        <w:rPr>
-          <w:rFonts w:ascii="Arial" w:eastAsia="Arial" w:hAnsi="Arial" w:cs="Arial"/>
-          <w:bCs/>
-          <w:lang w:val="en-US"/>
-        </w:rPr>
-        <w:t xml:space="preserve">if [ </w:t>
-      </w:r>
-      <w:proofErr w:type="spellStart"/>
-      <w:r>
-        <w:rPr>
-          <w:rFonts w:ascii="Arial" w:eastAsia="Arial" w:hAnsi="Arial" w:cs="Arial"/>
-          <w:bCs/>
-          <w:lang w:val="en-US"/>
-        </w:rPr>
-        <w:t>expresión</w:t>
-      </w:r>
-      <w:proofErr w:type="spellEnd"/>
-      <w:r>
-        <w:rPr>
-          <w:rFonts w:ascii="Arial" w:eastAsia="Arial" w:hAnsi="Arial" w:cs="Arial"/>
-          <w:bCs/>
-          <w:lang w:val="en-US"/>
-        </w:rPr>
-        <w:t xml:space="preserve"> ]; then </w:t>
-      </w:r>
-    </w:p>
-    <w:p>
-      <w:pPr>
-        <w:ind w:firstLine="708"/>
-        <w:rPr>
-          <w:rFonts w:ascii="Arial" w:eastAsia="Arial" w:hAnsi="Arial" w:cs="Arial"/>
-          <w:bCs/>
-          <w:lang w:val="en-US"/>
-        </w:rPr>
-      </w:pPr>
-      <w:proofErr w:type="spellStart"/>
-      <w:r>
-        <w:rPr>
-          <w:rFonts w:ascii="Arial" w:eastAsia="Arial" w:hAnsi="Arial" w:cs="Arial"/>
-          <w:bCs/>
-          <w:lang w:val="en-US"/>
-        </w:rPr>
-        <w:t>operaciones</w:t>
-      </w:r>
-      <w:proofErr w:type="spellEnd"/>
-      <w:r>
-        <w:rPr>
-          <w:rFonts w:ascii="Arial" w:eastAsia="Arial" w:hAnsi="Arial" w:cs="Arial"/>
-          <w:bCs/>
-          <w:lang w:val="en-US"/>
-        </w:rPr>
-        <w:t xml:space="preserve"> </w:t>
-      </w:r>
-    </w:p>
-    <w:p>
-      <w:pPr>
-        <w:rPr>
-          <w:rFonts w:ascii="Arial" w:eastAsia="Arial" w:hAnsi="Arial" w:cs="Arial"/>
-          <w:bCs/>
-          <w:lang w:val="en-US"/>
-        </w:rPr>
-      </w:pPr>
-      <w:r>
-        <w:rPr>
-          <w:rFonts w:ascii="Arial" w:eastAsia="Arial" w:hAnsi="Arial" w:cs="Arial"/>
-          <w:bCs/>
-          <w:lang w:val="en-US"/>
-        </w:rPr>
-        <w:t xml:space="preserve">elseif [ </w:t>
-      </w:r>
-      <w:proofErr w:type="spellStart"/>
-      <w:r>
-        <w:rPr>
-          <w:rFonts w:ascii="Arial" w:eastAsia="Arial" w:hAnsi="Arial" w:cs="Arial"/>
-          <w:bCs/>
-          <w:lang w:val="en-US"/>
-        </w:rPr>
-        <w:t>expresion</w:t>
-      </w:r>
-      <w:proofErr w:type="spellEnd"/>
-      <w:r>
-        <w:rPr>
-          <w:rFonts w:ascii="Arial" w:eastAsia="Arial" w:hAnsi="Arial" w:cs="Arial"/>
-          <w:bCs/>
-          <w:lang w:val="en-US"/>
-        </w:rPr>
-        <w:t xml:space="preserve"> ]; then </w:t>
-      </w:r>
-    </w:p>
-    <w:p>
-      <w:pPr>
-        <w:ind w:firstLine="708"/>
-        <w:rPr>
-          <w:rFonts w:ascii="Arial" w:eastAsia="Arial" w:hAnsi="Arial" w:cs="Arial"/>
-          <w:bCs/>
-        </w:rPr>
-      </w:pPr>
-      <w:r>
-        <w:rPr>
-          <w:rFonts w:ascii="Arial" w:eastAsia="Arial" w:hAnsi="Arial" w:cs="Arial"/>
-          <w:bCs/>
-        </w:rPr>
-        <w:t xml:space="preserve">operaciones </w:t>
-      </w:r>
-    </w:p>
-    <w:p>
-      <w:pPr>
-        <w:rPr>
-          <w:rFonts w:ascii="Arial" w:eastAsia="Arial" w:hAnsi="Arial" w:cs="Arial"/>
-          <w:bCs/>
-        </w:rPr>
-      </w:pPr>
-      <w:proofErr w:type="spellStart"/>
-      <w:r>
-        <w:rPr>
-          <w:rFonts w:ascii="Arial" w:eastAsia="Arial" w:hAnsi="Arial" w:cs="Arial"/>
-          <w:bCs/>
-        </w:rPr>
-        <w:t>else</w:t>
-      </w:r>
-      <w:proofErr w:type="spellEnd"/>
-      <w:r>
-        <w:rPr>
-          <w:rFonts w:ascii="Arial" w:eastAsia="Arial" w:hAnsi="Arial" w:cs="Arial"/>
-          <w:bCs/>
-        </w:rPr>
-        <w:t xml:space="preserve"> </w:t>
+      <w:r>
+        <w:rPr>
+          <w:rFonts w:ascii="Arial" w:eastAsia="Arial" w:hAnsi="Arial" w:cs="Arial"/>
+          <w:bCs/>
+        </w:rPr>
+        <w:t xml:space="preserve">else </w:t>
       </w:r>
     </w:p>
     <w:p>
@@ -3662,23 +2833,7 @@
           <w:rFonts w:ascii="Arial" w:eastAsia="Arial" w:hAnsi="Arial" w:cs="Arial"/>
           <w:bCs/>
         </w:rPr>
-        <w:t xml:space="preserve">! </w:t>
-      </w:r>
-      <w:proofErr w:type="spellStart"/>
-      <w:r>
-        <w:rPr>
-          <w:rFonts w:ascii="Arial" w:eastAsia="Arial" w:hAnsi="Arial" w:cs="Arial"/>
-          <w:bCs/>
-        </w:rPr>
-        <w:t>Not</w:t>
-      </w:r>
-      <w:proofErr w:type="spellEnd"/>
-      <w:r>
-        <w:rPr>
-          <w:rFonts w:ascii="Arial" w:eastAsia="Arial" w:hAnsi="Arial" w:cs="Arial"/>
-          <w:bCs/>
-        </w:rPr>
-        <w:t xml:space="preserve"> </w:t>
+        <w:t xml:space="preserve">! Not </w:t>
       </w:r>
     </w:p>
     <w:p>
@@ -3708,17 +2863,8 @@
           <w:rFonts w:ascii="Arial" w:eastAsia="Arial" w:hAnsi="Arial" w:cs="Arial"/>
           <w:bCs/>
         </w:rPr>
-        <w:t xml:space="preserve">-o </w:t>
-      </w:r>
-      <w:proofErr w:type="spellStart"/>
-      <w:r>
-        <w:rPr>
-          <w:rFonts w:ascii="Arial" w:eastAsia="Arial" w:hAnsi="Arial" w:cs="Arial"/>
-          <w:bCs/>
-        </w:rPr>
-        <w:t>Or</w:t>
-      </w:r>
-      <w:proofErr w:type="spellEnd"/>
+        <w:t>-o Or</w:t>
+      </w:r>
     </w:p>
     <w:p>
       <w:pPr>
@@ -3887,43 +3033,7 @@
           <w:b/>
           <w:bCs/>
         </w:rPr>
-        <w:t xml:space="preserve">Cree un alias para los comandos date, </w:t>
-      </w:r>
-      <w:proofErr w:type="spellStart"/>
-      <w:r>
-        <w:rPr>
-          <w:rFonts w:ascii="Arial" w:eastAsia="Arial" w:hAnsi="Arial" w:cs="Arial"/>
-          <w:b/>
-          <w:bCs/>
-        </w:rPr>
-        <w:t>cp</w:t>
-      </w:r>
-      <w:proofErr w:type="spellEnd"/>
-      <w:r>
-        <w:rPr>
-          <w:rFonts w:ascii="Arial" w:eastAsia="Arial" w:hAnsi="Arial" w:cs="Arial"/>
-          <w:b/>
-          <w:bCs/>
-        </w:rPr>
-        <w:t xml:space="preserve"> y </w:t>
-      </w:r>
-      <w:proofErr w:type="spellStart"/>
-      <w:r>
-        <w:rPr>
-          <w:rFonts w:ascii="Arial" w:eastAsia="Arial" w:hAnsi="Arial" w:cs="Arial"/>
-          <w:b/>
-          <w:bCs/>
-        </w:rPr>
-        <w:t>finger</w:t>
-      </w:r>
-      <w:proofErr w:type="spellEnd"/>
-      <w:r>
-        <w:rPr>
-          <w:rFonts w:ascii="Arial" w:eastAsia="Arial" w:hAnsi="Arial" w:cs="Arial"/>
-          <w:b/>
-          <w:bCs/>
-        </w:rPr>
-        <w:t>.</w:t>
+        <w:t>Cree un alias para los comandos date, cp y finger.</w:t>
       </w:r>
     </w:p>
     <w:p>
@@ -4216,25 +3326,7 @@
           <w:bCs/>
         </w:rPr>
         <w:lastRenderedPageBreak/>
-        <w:t xml:space="preserve">Hacer un </w:t>
-      </w:r>
-      <w:proofErr w:type="spellStart"/>
-      <w:r>
-        <w:rPr>
-          <w:rFonts w:ascii="Arial" w:eastAsia="Arial" w:hAnsi="Arial" w:cs="Arial"/>
-          <w:b/>
-          <w:bCs/>
-        </w:rPr>
-        <w:t>shell</w:t>
-      </w:r>
-      <w:proofErr w:type="spellEnd"/>
-      <w:r>
-        <w:rPr>
-          <w:rFonts w:ascii="Arial" w:eastAsia="Arial" w:hAnsi="Arial" w:cs="Arial"/>
-          <w:b/>
-          <w:bCs/>
-        </w:rPr>
-        <w:t xml:space="preserve"> script que muestre solamente la hora del sistema.</w:t>
+        <w:t>Hacer un shell script que muestre solamente la hora del sistema.</w:t>
       </w:r>
     </w:p>
     <w:p>
@@ -4472,21 +3564,7 @@
         <w:rPr>
           <w:rFonts w:ascii="Arial" w:eastAsia="Arial" w:hAnsi="Arial" w:cs="Arial"/>
         </w:rPr>
-        <w:t xml:space="preserve"> que es en donde </w:t>
-      </w:r>
-      <w:proofErr w:type="spellStart"/>
-      <w:r>
-        <w:rPr>
-          <w:rFonts w:ascii="Arial" w:eastAsia="Arial" w:hAnsi="Arial" w:cs="Arial"/>
-        </w:rPr>
-        <w:t>esta</w:t>
-      </w:r>
-      <w:proofErr w:type="spellEnd"/>
-      <w:r>
-        <w:rPr>
-          <w:rFonts w:ascii="Arial" w:eastAsia="Arial" w:hAnsi="Arial" w:cs="Arial"/>
-        </w:rPr>
-        <w:t xml:space="preserve"> la hora y </w:t>
+        <w:t xml:space="preserve"> que es en donde esta la hora y </w:t>
       </w:r>
       <w:r>
         <w:rPr>
@@ -4510,21 +3588,7 @@
         <w:rPr>
           <w:rFonts w:ascii="Arial" w:eastAsia="Arial" w:hAnsi="Arial" w:cs="Arial"/>
         </w:rPr>
-        <w:t xml:space="preserve"> </w:t>
-      </w:r>
-      <w:proofErr w:type="spellStart"/>
-      <w:r>
-        <w:rPr>
-          <w:rFonts w:ascii="Arial" w:eastAsia="Arial" w:hAnsi="Arial" w:cs="Arial"/>
-        </w:rPr>
-        <w:t>y</w:t>
-      </w:r>
-      <w:proofErr w:type="spellEnd"/>
-      <w:r>
-        <w:rPr>
-          <w:rFonts w:ascii="Arial" w:eastAsia="Arial" w:hAnsi="Arial" w:cs="Arial"/>
-        </w:rPr>
-        <w:t xml:space="preserve"> imprimimos la </w:t>
+        <w:t xml:space="preserve"> y imprimimos la </w:t>
       </w:r>
       <w:r>
         <w:rPr>
@@ -4552,25 +3616,7 @@
           <w:b/>
           <w:bCs/>
         </w:rPr>
-        <w:t xml:space="preserve">. Hacer un </w:t>
-      </w:r>
-      <w:proofErr w:type="spellStart"/>
-      <w:r>
-        <w:rPr>
-          <w:rFonts w:ascii="Arial" w:eastAsia="Arial" w:hAnsi="Arial" w:cs="Arial"/>
-          <w:b/>
-          <w:bCs/>
-        </w:rPr>
-        <w:t>shell</w:t>
-      </w:r>
-      <w:proofErr w:type="spellEnd"/>
-      <w:r>
-        <w:rPr>
-          <w:rFonts w:ascii="Arial" w:eastAsia="Arial" w:hAnsi="Arial" w:cs="Arial"/>
-          <w:b/>
-          <w:bCs/>
-        </w:rPr>
-        <w:t xml:space="preserve"> script que muestre el directorio actual y el nombre real del usuario.</w:t>
+        <w:t>. Hacer un shell script que muestre el directorio actual y el nombre real del usuario.</w:t>
       </w:r>
     </w:p>
     <w:p>
@@ -4765,61 +3811,27 @@
         </w:rPr>
         <w:t xml:space="preserve"> </w:t>
       </w:r>
-      <w:proofErr w:type="spellStart"/>
-      <w:r>
-        <w:rPr>
-          <w:rFonts w:ascii="Arial" w:eastAsia="Arial" w:hAnsi="Arial" w:cs="Arial"/>
-          <w:b/>
-          <w:bCs/>
-        </w:rPr>
-        <w:t>pwd</w:t>
-      </w:r>
-      <w:proofErr w:type="spellEnd"/>
-      <w:r>
-        <w:rPr>
-          <w:rFonts w:ascii="Arial" w:eastAsia="Arial" w:hAnsi="Arial" w:cs="Arial"/>
-          <w:b/>
-          <w:bCs/>
-        </w:rPr>
-        <w:t xml:space="preserve"> </w:t>
-      </w:r>
-      <w:r>
-        <w:rPr>
-          <w:rFonts w:ascii="Arial" w:eastAsia="Arial" w:hAnsi="Arial" w:cs="Arial"/>
-        </w:rPr>
-        <w:t xml:space="preserve">nos da el directorio actual en donde se </w:t>
-      </w:r>
-      <w:proofErr w:type="spellStart"/>
-      <w:r>
-        <w:rPr>
-          <w:rFonts w:ascii="Arial" w:eastAsia="Arial" w:hAnsi="Arial" w:cs="Arial"/>
-        </w:rPr>
-        <w:t>esta</w:t>
-      </w:r>
-      <w:proofErr w:type="spellEnd"/>
-      <w:r>
-        <w:rPr>
-          <w:rFonts w:ascii="Arial" w:eastAsia="Arial" w:hAnsi="Arial" w:cs="Arial"/>
-        </w:rPr>
-        <w:t xml:space="preserve"> trabajando y el comando </w:t>
-      </w:r>
-      <w:proofErr w:type="spellStart"/>
-      <w:r>
-        <w:rPr>
-          <w:rFonts w:ascii="Arial" w:eastAsia="Arial" w:hAnsi="Arial" w:cs="Arial"/>
-          <w:b/>
-          <w:bCs/>
-        </w:rPr>
-        <w:t>whoami</w:t>
-      </w:r>
-      <w:proofErr w:type="spellEnd"/>
-      <w:r>
-        <w:rPr>
-          <w:rFonts w:ascii="Arial" w:eastAsia="Arial" w:hAnsi="Arial" w:cs="Arial"/>
-          <w:b/>
-          <w:bCs/>
-        </w:rPr>
-        <w:t xml:space="preserve"> </w:t>
+      <w:r>
+        <w:rPr>
+          <w:rFonts w:ascii="Arial" w:eastAsia="Arial" w:hAnsi="Arial" w:cs="Arial"/>
+          <w:b/>
+          <w:bCs/>
+        </w:rPr>
+        <w:t xml:space="preserve">pwd </w:t>
+      </w:r>
+      <w:r>
+        <w:rPr>
+          <w:rFonts w:ascii="Arial" w:eastAsia="Arial" w:hAnsi="Arial" w:cs="Arial"/>
+        </w:rPr>
+        <w:t xml:space="preserve">nos da el directorio actual en donde se esta trabajando y el comando </w:t>
+      </w:r>
+      <w:r>
+        <w:rPr>
+          <w:rFonts w:ascii="Arial" w:eastAsia="Arial" w:hAnsi="Arial" w:cs="Arial"/>
+          <w:b/>
+          <w:bCs/>
+        </w:rPr>
+        <w:t xml:space="preserve">whoami </w:t>
       </w:r>
       <w:r>
         <w:rPr>
@@ -4847,25 +3859,7 @@
           <w:b/>
           <w:bCs/>
         </w:rPr>
-        <w:t xml:space="preserve">Hacer un </w:t>
-      </w:r>
-      <w:proofErr w:type="spellStart"/>
-      <w:r>
-        <w:rPr>
-          <w:rFonts w:ascii="Arial" w:eastAsia="Arial" w:hAnsi="Arial" w:cs="Arial"/>
-          <w:b/>
-          <w:bCs/>
-        </w:rPr>
-        <w:t>shell</w:t>
-      </w:r>
-      <w:proofErr w:type="spellEnd"/>
-      <w:r>
-        <w:rPr>
-          <w:rFonts w:ascii="Arial" w:eastAsia="Arial" w:hAnsi="Arial" w:cs="Arial"/>
-          <w:b/>
-          <w:bCs/>
-        </w:rPr>
-        <w:t xml:space="preserve"> script que pida el nombre de un archivo, busque el archivo y muestre su contenido, el número de líneas, palabras y caracteres que contiene</w:t>
+        <w:t>Hacer un shell script que pida el nombre de un archivo, busque el archivo y muestre su contenido, el número de líneas, palabras y caracteres que contiene</w:t>
       </w:r>
     </w:p>
     <w:p>
@@ -4882,6 +3876,7 @@
           <w:rFonts w:ascii="Arial" w:eastAsia="Arial" w:hAnsi="Arial" w:cs="Arial"/>
           <w:b/>
           <w:bCs/>
+          <w:noProof/>
         </w:rPr>
         <w:drawing>
           <wp:inline distT="0" distB="0" distL="0" distR="0" wp14:anchorId="2EBE42F0" wp14:editId="44992B34">
@@ -5061,21 +4056,7 @@
         <w:rPr>
           <w:rFonts w:ascii="Arial" w:eastAsia="Arial" w:hAnsi="Arial" w:cs="Arial"/>
         </w:rPr>
-        <w:t xml:space="preserve"> se representan en </w:t>
-      </w:r>
-      <w:proofErr w:type="spellStart"/>
-      <w:r>
-        <w:rPr>
-          <w:rFonts w:ascii="Arial" w:eastAsia="Arial" w:hAnsi="Arial" w:cs="Arial"/>
-        </w:rPr>
-        <w:t>bash</w:t>
-      </w:r>
-      <w:proofErr w:type="spellEnd"/>
-      <w:r>
-        <w:rPr>
-          <w:rFonts w:ascii="Arial" w:eastAsia="Arial" w:hAnsi="Arial" w:cs="Arial"/>
-        </w:rPr>
-        <w:t xml:space="preserve"> como </w:t>
+        <w:t xml:space="preserve"> se representan en bash como </w:t>
       </w:r>
       <w:r>
         <w:rPr>
@@ -5147,16 +4128,62 @@
         </w:rPr>
         <w:t xml:space="preserve">Realizamos la sustitución de comando del comando </w:t>
       </w:r>
-      <w:proofErr w:type="spellStart"/>
-      <w:r>
-        <w:rPr>
-          <w:rFonts w:ascii="Arial" w:eastAsia="Arial" w:hAnsi="Arial" w:cs="Arial"/>
-          <w:b/>
-          <w:bCs/>
-        </w:rPr>
-        <w:t>wc</w:t>
-      </w:r>
-      <w:proofErr w:type="spellEnd"/>
+      <w:r>
+        <w:rPr>
+          <w:rFonts w:ascii="Arial" w:eastAsia="Arial" w:hAnsi="Arial" w:cs="Arial"/>
+          <w:b/>
+          <w:bCs/>
+        </w:rPr>
+        <w:t xml:space="preserve">wc </w:t>
+      </w:r>
+      <w:r>
+        <w:rPr>
+          <w:rFonts w:ascii="Arial" w:eastAsia="Arial" w:hAnsi="Arial" w:cs="Arial"/>
+        </w:rPr>
+        <w:t xml:space="preserve">el cual con sus diferentes parámetros </w:t>
+      </w:r>
+      <w:r>
+        <w:rPr>
+          <w:rFonts w:ascii="Arial" w:eastAsia="Arial" w:hAnsi="Arial" w:cs="Arial"/>
+          <w:b/>
+          <w:bCs/>
+        </w:rPr>
+        <w:t xml:space="preserve">-l -&gt; </w:t>
+      </w:r>
+      <w:r>
+        <w:rPr>
+          <w:rFonts w:ascii="Arial" w:eastAsia="Arial" w:hAnsi="Arial" w:cs="Arial"/>
+        </w:rPr>
+        <w:t>nos muestra el total de líneas que tiene el archivo</w:t>
+      </w:r>
+      <w:r>
+        <w:rPr>
+          <w:rFonts w:ascii="Arial" w:eastAsia="Arial" w:hAnsi="Arial" w:cs="Arial"/>
+          <w:b/>
+          <w:bCs/>
+        </w:rPr>
+        <w:t xml:space="preserve">, </w:t>
+      </w:r>
+      <w:r>
+        <w:rPr>
+          <w:rFonts w:ascii="Arial" w:eastAsia="Arial" w:hAnsi="Arial" w:cs="Arial"/>
+          <w:b/>
+          <w:bCs/>
+        </w:rPr>
+        <w:t xml:space="preserve">-c -&gt; </w:t>
+      </w:r>
+      <w:r>
+        <w:rPr>
+          <w:rFonts w:ascii="Arial" w:eastAsia="Arial" w:hAnsi="Arial" w:cs="Arial"/>
+        </w:rPr>
+        <w:t xml:space="preserve">nos muestra el total de caracteres que </w:t>
+      </w:r>
+      <w:r>
+        <w:rPr>
+          <w:rFonts w:ascii="Arial" w:eastAsia="Arial" w:hAnsi="Arial" w:cs="Arial"/>
+        </w:rPr>
+        <w:t>tiene,</w:t>
+      </w:r>
       <w:r>
         <w:rPr>
           <w:rFonts w:ascii="Arial" w:eastAsia="Arial" w:hAnsi="Arial" w:cs="Arial"/>
@@ -5164,56 +4191,6 @@
           <w:bCs/>
         </w:rPr>
         <w:t xml:space="preserve"> </w:t>
-      </w:r>
-      <w:r>
-        <w:rPr>
-          <w:rFonts w:ascii="Arial" w:eastAsia="Arial" w:hAnsi="Arial" w:cs="Arial"/>
-        </w:rPr>
-        <w:t xml:space="preserve">el cual con sus diferentes parámetros </w:t>
-      </w:r>
-      <w:r>
-        <w:rPr>
-          <w:rFonts w:ascii="Arial" w:eastAsia="Arial" w:hAnsi="Arial" w:cs="Arial"/>
-          <w:b/>
-          <w:bCs/>
-        </w:rPr>
-        <w:t xml:space="preserve">-l -&gt; </w:t>
-      </w:r>
-      <w:r>
-        <w:rPr>
-          <w:rFonts w:ascii="Arial" w:eastAsia="Arial" w:hAnsi="Arial" w:cs="Arial"/>
-        </w:rPr>
-        <w:t>nos muestra el total de líneas que tiene el archivo</w:t>
-      </w:r>
-      <w:r>
-        <w:rPr>
-          <w:rFonts w:ascii="Arial" w:eastAsia="Arial" w:hAnsi="Arial" w:cs="Arial"/>
-          <w:b/>
-          <w:bCs/>
-        </w:rPr>
-        <w:t xml:space="preserve">, </w:t>
-      </w:r>
-      <w:r>
-        <w:rPr>
-          <w:rFonts w:ascii="Arial" w:eastAsia="Arial" w:hAnsi="Arial" w:cs="Arial"/>
-          <w:b/>
-          <w:bCs/>
-        </w:rPr>
-        <w:t xml:space="preserve">-c -&gt; </w:t>
-      </w:r>
-      <w:r>
-        <w:rPr>
-          <w:rFonts w:ascii="Arial" w:eastAsia="Arial" w:hAnsi="Arial" w:cs="Arial"/>
-        </w:rPr>
-        <w:t xml:space="preserve">nos muestra el total de caracteres que tiene </w:t>
-      </w:r>
-      <w:r>
-        <w:rPr>
-          <w:rFonts w:ascii="Arial" w:eastAsia="Arial" w:hAnsi="Arial" w:cs="Arial"/>
-          <w:b/>
-          <w:bCs/>
-        </w:rPr>
-        <w:t xml:space="preserve">, </w:t>
       </w:r>
       <w:r>
         <w:rPr>
@@ -5258,25 +4235,7 @@
           <w:bCs/>
         </w:rPr>
         <w:lastRenderedPageBreak/>
-        <w:t xml:space="preserve">. Hacer un </w:t>
-      </w:r>
-      <w:proofErr w:type="spellStart"/>
-      <w:r>
-        <w:rPr>
-          <w:rFonts w:ascii="Arial" w:eastAsia="Arial" w:hAnsi="Arial" w:cs="Arial"/>
-          <w:b/>
-          <w:bCs/>
-        </w:rPr>
-        <w:t>shell</w:t>
-      </w:r>
-      <w:proofErr w:type="spellEnd"/>
-      <w:r>
-        <w:rPr>
-          <w:rFonts w:ascii="Arial" w:eastAsia="Arial" w:hAnsi="Arial" w:cs="Arial"/>
-          <w:b/>
-          <w:bCs/>
-        </w:rPr>
-        <w:t xml:space="preserve"> script que pida los nombres tres archivos, sustituya los caracteres de mayúsculas a minúsculas en el primero, cambie todos los números por asteriscos al segundo y el tercero permanece igual. Muestre en pantalla los tres archivos y pida al usuario el nombre del archivo donde se guardarán los tres archivos.</w:t>
+        <w:t>. Hacer un shell script que pida los nombres tres archivos, sustituya los caracteres de mayúsculas a minúsculas en el primero, cambie todos los números por asteriscos al segundo y el tercero permanece igual. Muestre en pantalla los tres archivos y pida al usuario el nombre del archivo donde se guardarán los tres archivos.</w:t>
       </w:r>
       <w:r>
         <w:rPr>
@@ -5784,7 +4743,6 @@
         </w:rPr>
         <w:t xml:space="preserve">y </w:t>
       </w:r>
-      <w:proofErr w:type="spellStart"/>
       <w:r>
         <w:rPr>
           <w:rFonts w:ascii="Arial" w:eastAsia="Arial" w:hAnsi="Arial" w:cs="Arial"/>
@@ -5793,7 +4751,6 @@
         </w:rPr>
         <w:t>read</w:t>
       </w:r>
-      <w:proofErr w:type="spellEnd"/>
       <w:r>
         <w:rPr>
           <w:rFonts w:ascii="Arial" w:eastAsia="Arial" w:hAnsi="Arial" w:cs="Arial"/>
@@ -5934,35 +4891,7 @@
         <w:rPr>
           <w:rFonts w:ascii="Arial" w:eastAsia="Arial" w:hAnsi="Arial" w:cs="Arial"/>
         </w:rPr>
-        <w:t xml:space="preserve">Si no es el caso manda al </w:t>
-      </w:r>
-      <w:proofErr w:type="spellStart"/>
-      <w:r>
-        <w:rPr>
-          <w:rFonts w:ascii="Arial" w:eastAsia="Arial" w:hAnsi="Arial" w:cs="Arial"/>
-        </w:rPr>
-        <w:t>else</w:t>
-      </w:r>
-      <w:proofErr w:type="spellEnd"/>
-      <w:r>
-        <w:rPr>
-          <w:rFonts w:ascii="Arial" w:eastAsia="Arial" w:hAnsi="Arial" w:cs="Arial"/>
-        </w:rPr>
-        <w:t xml:space="preserve">, lo que hace el </w:t>
-      </w:r>
-      <w:proofErr w:type="spellStart"/>
-      <w:r>
-        <w:rPr>
-          <w:rFonts w:ascii="Arial" w:eastAsia="Arial" w:hAnsi="Arial" w:cs="Arial"/>
-        </w:rPr>
-        <w:t>else</w:t>
-      </w:r>
-      <w:proofErr w:type="spellEnd"/>
-      <w:r>
-        <w:rPr>
-          <w:rFonts w:ascii="Arial" w:eastAsia="Arial" w:hAnsi="Arial" w:cs="Arial"/>
-        </w:rPr>
-        <w:t xml:space="preserve"> es ver que archivo es el que falla, negamos la condicional </w:t>
+        <w:t xml:space="preserve">Si no es el caso manda al else, lo que hace el else es ver que archivo es el que falla, negamos la condicional </w:t>
       </w:r>
       <w:r>
         <w:rPr>
@@ -6106,23 +5035,13 @@
         </w:rPr>
         <w:t xml:space="preserve">Ingrese 2 archivos que si existen en mi directorio actual </w:t>
       </w:r>
-      <w:proofErr w:type="spellStart"/>
-      <w:r>
-        <w:rPr>
-          <w:rFonts w:ascii="Arial" w:eastAsia="Arial" w:hAnsi="Arial" w:cs="Arial"/>
-          <w:b/>
-          <w:bCs/>
-        </w:rPr>
-        <w:t>upper_lower</w:t>
-      </w:r>
-      <w:proofErr w:type="spellEnd"/>
-      <w:r>
-        <w:rPr>
-          <w:rFonts w:ascii="Arial" w:eastAsia="Arial" w:hAnsi="Arial" w:cs="Arial"/>
-          <w:b/>
-          <w:bCs/>
-        </w:rPr>
-        <w:t xml:space="preserve"> y </w:t>
+      <w:r>
+        <w:rPr>
+          <w:rFonts w:ascii="Arial" w:eastAsia="Arial" w:hAnsi="Arial" w:cs="Arial"/>
+          <w:b/>
+          <w:bCs/>
+        </w:rPr>
+        <w:t xml:space="preserve">upper_lower y </w:t>
       </w:r>
       <w:r>
         <w:rPr>
@@ -6264,23 +5183,13 @@
         </w:rPr>
         <w:t xml:space="preserve"> </w:t>
       </w:r>
-      <w:proofErr w:type="spellStart"/>
-      <w:r>
-        <w:rPr>
-          <w:rFonts w:ascii="Arial" w:eastAsia="Arial" w:hAnsi="Arial" w:cs="Arial"/>
-          <w:b/>
-          <w:bCs/>
-        </w:rPr>
-        <w:t>tr</w:t>
-      </w:r>
-      <w:proofErr w:type="spellEnd"/>
-      <w:r>
-        <w:rPr>
-          <w:rFonts w:ascii="Arial" w:eastAsia="Arial" w:hAnsi="Arial" w:cs="Arial"/>
-          <w:b/>
-          <w:bCs/>
-        </w:rPr>
-        <w:t xml:space="preserve"> </w:t>
+      <w:r>
+        <w:rPr>
+          <w:rFonts w:ascii="Arial" w:eastAsia="Arial" w:hAnsi="Arial" w:cs="Arial"/>
+          <w:b/>
+          <w:bCs/>
+        </w:rPr>
+        <w:t xml:space="preserve">tr </w:t>
       </w:r>
       <w:r>
         <w:rPr>
@@ -6412,25 +5321,7 @@
           <w:b/>
           <w:bCs/>
         </w:rPr>
-        <w:t xml:space="preserve">Hacer un </w:t>
-      </w:r>
-      <w:proofErr w:type="spellStart"/>
-      <w:r>
-        <w:rPr>
-          <w:rFonts w:ascii="Arial" w:eastAsia="Arial" w:hAnsi="Arial" w:cs="Arial"/>
-          <w:b/>
-          <w:bCs/>
-        </w:rPr>
-        <w:t>shell</w:t>
-      </w:r>
-      <w:proofErr w:type="spellEnd"/>
-      <w:r>
-        <w:rPr>
-          <w:rFonts w:ascii="Arial" w:eastAsia="Arial" w:hAnsi="Arial" w:cs="Arial"/>
-          <w:b/>
-          <w:bCs/>
-        </w:rPr>
-        <w:t xml:space="preserve"> que pida el nombre real de una persona, encuentre su nombre de usuario, muestre los procesos que está ejecutando y le envíe un mensaje en tiempo real.</w:t>
+        <w:t>Hacer un shell que pida el nombre real de una persona, encuentre su nombre de usuario, muestre los procesos que está ejecutando y le envíe un mensaje en tiempo real.</w:t>
       </w:r>
       <w:r>
         <w:rPr>
@@ -6571,14 +5462,12 @@
         </w:rPr>
         <w:t xml:space="preserve">lo que se realizo es </w:t>
       </w:r>
-      <w:proofErr w:type="spellStart"/>
-      <w:r>
-        <w:rPr>
-          <w:rFonts w:ascii="Arial" w:eastAsia="Arial" w:hAnsi="Arial" w:cs="Arial"/>
-        </w:rPr>
-        <w:t>primreo</w:t>
-      </w:r>
-      <w:proofErr w:type="spellEnd"/>
+      <w:r>
+        <w:rPr>
+          <w:rFonts w:ascii="Arial" w:eastAsia="Arial" w:hAnsi="Arial" w:cs="Arial"/>
+        </w:rPr>
+        <w:t>primero</w:t>
+      </w:r>
       <w:r>
         <w:rPr>
           <w:rFonts w:ascii="Arial" w:eastAsia="Arial" w:hAnsi="Arial" w:cs="Arial"/>
@@ -6591,33 +5480,17 @@
         </w:rPr>
         <w:t xml:space="preserve">Entonces la </w:t>
       </w:r>
-      <w:proofErr w:type="spellStart"/>
-      <w:r>
-        <w:rPr>
-          <w:rFonts w:ascii="Arial" w:eastAsia="Arial" w:hAnsi="Arial" w:cs="Arial"/>
-        </w:rPr>
-        <w:t>vairbale</w:t>
-      </w:r>
-      <w:proofErr w:type="spellEnd"/>
-      <w:r>
-        <w:rPr>
-          <w:rFonts w:ascii="Arial" w:eastAsia="Arial" w:hAnsi="Arial" w:cs="Arial"/>
-        </w:rPr>
-        <w:t xml:space="preserve"> “</w:t>
-      </w:r>
-      <w:proofErr w:type="spellStart"/>
-      <w:r>
-        <w:rPr>
-          <w:rFonts w:ascii="Arial" w:eastAsia="Arial" w:hAnsi="Arial" w:cs="Arial"/>
-        </w:rPr>
-        <w:t>user_name</w:t>
-      </w:r>
-      <w:proofErr w:type="spellEnd"/>
-      <w:r>
-        <w:rPr>
-          <w:rFonts w:ascii="Arial" w:eastAsia="Arial" w:hAnsi="Arial" w:cs="Arial"/>
-        </w:rPr>
-        <w:t xml:space="preserve">” es la que sustituye el comando </w:t>
+      <w:r>
+        <w:rPr>
+          <w:rFonts w:ascii="Arial" w:eastAsia="Arial" w:hAnsi="Arial" w:cs="Arial"/>
+        </w:rPr>
+        <w:t>variable</w:t>
+      </w:r>
+      <w:r>
+        <w:rPr>
+          <w:rFonts w:ascii="Arial" w:eastAsia="Arial" w:hAnsi="Arial" w:cs="Arial"/>
+        </w:rPr>
+        <w:t xml:space="preserve"> “user_name” es la que sustituye el comando </w:t>
       </w:r>
     </w:p>
     <w:p>
@@ -6653,14 +5526,12 @@
         </w:rPr>
         <w:t xml:space="preserve">todos los </w:t>
       </w:r>
-      <w:proofErr w:type="spellStart"/>
-      <w:r>
-        <w:rPr>
-          <w:rFonts w:ascii="Arial" w:eastAsia="Arial" w:hAnsi="Arial" w:cs="Arial"/>
-        </w:rPr>
-        <w:t>usarios</w:t>
-      </w:r>
-      <w:proofErr w:type="spellEnd"/>
+      <w:r>
+        <w:rPr>
+          <w:rFonts w:ascii="Arial" w:eastAsia="Arial" w:hAnsi="Arial" w:cs="Arial"/>
+        </w:rPr>
+        <w:t>usuarios</w:t>
+      </w:r>
       <w:r>
         <w:rPr>
           <w:rFonts w:ascii="Arial" w:eastAsia="Arial" w:hAnsi="Arial" w:cs="Arial"/>
@@ -6709,7 +5580,19 @@
         <w:rPr>
           <w:rFonts w:ascii="Arial" w:eastAsia="Arial" w:hAnsi="Arial" w:cs="Arial"/>
         </w:rPr>
-        <w:t xml:space="preserve">por ultimo cortamos el nombre el cual se encuentra en la primera columna del comando </w:t>
+        <w:t xml:space="preserve">por </w:t>
+      </w:r>
+      <w:r>
+        <w:rPr>
+          <w:rFonts w:ascii="Arial" w:eastAsia="Arial" w:hAnsi="Arial" w:cs="Arial"/>
+        </w:rPr>
+        <w:t>último</w:t>
+      </w:r>
+      <w:r>
+        <w:rPr>
+          <w:rFonts w:ascii="Arial" w:eastAsia="Arial" w:hAnsi="Arial" w:cs="Arial"/>
+        </w:rPr>
+        <w:t xml:space="preserve"> cortamos el nombre el cual se encuentra en la primera columna del comando </w:t>
       </w:r>
       <w:r>
         <w:rPr>
@@ -6733,47 +5616,17 @@
         </w:rPr>
         <w:t xml:space="preserve">para poder seguir la </w:t>
       </w:r>
-      <w:proofErr w:type="spellStart"/>
-      <w:r>
-        <w:rPr>
-          <w:rFonts w:ascii="Arial" w:eastAsia="Arial" w:hAnsi="Arial" w:cs="Arial"/>
-        </w:rPr>
-        <w:t>varibale</w:t>
-      </w:r>
-      <w:proofErr w:type="spellEnd"/>
-      <w:r>
-        <w:rPr>
-          <w:rFonts w:ascii="Arial" w:eastAsia="Arial" w:hAnsi="Arial" w:cs="Arial"/>
-        </w:rPr>
-        <w:t xml:space="preserve"> debe de tener algo, nos </w:t>
-      </w:r>
-      <w:proofErr w:type="spellStart"/>
-      <w:r>
-        <w:rPr>
-          <w:rFonts w:ascii="Arial" w:eastAsia="Arial" w:hAnsi="Arial" w:cs="Arial"/>
-        </w:rPr>
-        <w:t>devio</w:t>
-      </w:r>
-      <w:proofErr w:type="spellEnd"/>
-      <w:r>
-        <w:rPr>
-          <w:rFonts w:ascii="Arial" w:eastAsia="Arial" w:hAnsi="Arial" w:cs="Arial"/>
-        </w:rPr>
-        <w:t xml:space="preserve"> de regresar el nombre dentro de los usuarios, en otro caso no lo encontró puesto que no </w:t>
-      </w:r>
-      <w:proofErr w:type="spellStart"/>
-      <w:r>
-        <w:rPr>
-          <w:rFonts w:ascii="Arial" w:eastAsia="Arial" w:hAnsi="Arial" w:cs="Arial"/>
-        </w:rPr>
-        <w:t>esta</w:t>
-      </w:r>
-      <w:proofErr w:type="spellEnd"/>
-      <w:r>
-        <w:rPr>
-          <w:rFonts w:ascii="Arial" w:eastAsia="Arial" w:hAnsi="Arial" w:cs="Arial"/>
-        </w:rPr>
-        <w:t xml:space="preserve"> conectado </w:t>
+      <w:r>
+        <w:rPr>
+          <w:rFonts w:ascii="Arial" w:eastAsia="Arial" w:hAnsi="Arial" w:cs="Arial"/>
+        </w:rPr>
+        <w:t>variable</w:t>
+      </w:r>
+      <w:r>
+        <w:rPr>
+          <w:rFonts w:ascii="Arial" w:eastAsia="Arial" w:hAnsi="Arial" w:cs="Arial"/>
+        </w:rPr>
+        <w:t xml:space="preserve"> debe de tener algo, nos devio de regresar el nombre dentro de los usuarios, en otro caso no lo encontró puesto que no esta conectado </w:t>
       </w:r>
       <w:r>
         <w:rPr>
@@ -6906,6 +5759,34 @@
       <w:pPr>
         <w:rPr>
           <w:rFonts w:ascii="Arial" w:eastAsia="Arial" w:hAnsi="Arial" w:cs="Arial"/>
+        </w:rPr>
+      </w:pPr>
+    </w:p>
+    <w:p>
+      <w:pPr>
+        <w:rPr>
+          <w:rFonts w:ascii="Arial" w:eastAsia="Arial" w:hAnsi="Arial" w:cs="Arial"/>
+        </w:rPr>
+      </w:pPr>
+    </w:p>
+    <w:p>
+      <w:pPr>
+        <w:rPr>
+          <w:rFonts w:ascii="Arial" w:eastAsia="Arial" w:hAnsi="Arial" w:cs="Arial"/>
+        </w:rPr>
+      </w:pPr>
+    </w:p>
+    <w:p>
+      <w:pPr>
+        <w:rPr>
+          <w:rFonts w:ascii="Arial" w:eastAsia="Arial" w:hAnsi="Arial" w:cs="Arial"/>
+        </w:rPr>
+      </w:pPr>
+    </w:p>
+    <w:p>
+      <w:pPr>
+        <w:rPr>
+          <w:rFonts w:ascii="Arial" w:eastAsia="Arial" w:hAnsi="Arial" w:cs="Arial"/>
           <w:b/>
           <w:bCs/>
         </w:rPr>
@@ -6930,6 +5811,7 @@
           <w:b/>
           <w:bCs/>
         </w:rPr>
+        <w:lastRenderedPageBreak/>
         <w:t>. Elimine el alias para el comando cp.</w:t>
       </w:r>
     </w:p>
@@ -6947,8 +5829,8 @@
           <w:rFonts w:ascii="Arial" w:eastAsia="Arial" w:hAnsi="Arial" w:cs="Arial"/>
           <w:b/>
           <w:bCs/>
-        </w:rPr>
-        <w:lastRenderedPageBreak/>
+          <w:noProof/>
+        </w:rPr>
         <w:drawing>
           <wp:inline distT="0" distB="0" distL="0" distR="0" wp14:anchorId="5EE5251D" wp14:editId="17CDBECD">
             <wp:extent cx="2048161" cy="924054"/>
@@ -7005,25 +5887,7 @@
           <w:b/>
           <w:bCs/>
         </w:rPr>
-        <w:t xml:space="preserve">Hacer un </w:t>
-      </w:r>
-      <w:proofErr w:type="spellStart"/>
-      <w:r>
-        <w:rPr>
-          <w:rFonts w:ascii="Arial" w:eastAsia="Arial" w:hAnsi="Arial" w:cs="Arial"/>
-          <w:b/>
-          <w:bCs/>
-        </w:rPr>
-        <w:t>shell</w:t>
-      </w:r>
-      <w:proofErr w:type="spellEnd"/>
-      <w:r>
-        <w:rPr>
-          <w:rFonts w:ascii="Arial" w:eastAsia="Arial" w:hAnsi="Arial" w:cs="Arial"/>
-          <w:b/>
-          <w:bCs/>
-        </w:rPr>
-        <w:t xml:space="preserve"> que tome de la línea de comando un número N y un nombre de archivo. Muestre las primeras y últimas N líneas del archivo especificado en la línea de comando.</w:t>
+        <w:t>Hacer un shell que tome de la línea de comando un número N y un nombre de archivo. Muestre las primeras y últimas N líneas del archivo especificado en la línea de comando.</w:t>
       </w:r>
     </w:p>
     <w:p>
@@ -7156,30 +6020,13 @@
       <w:pPr>
         <w:rPr>
           <w:rFonts w:ascii="Arial" w:eastAsia="Arial" w:hAnsi="Arial" w:cs="Arial"/>
-          <w:b/>
-          <w:bCs/>
-        </w:rPr>
-      </w:pPr>
-    </w:p>
-    <w:p>
-      <w:pPr>
-        <w:rPr>
-          <w:rFonts w:ascii="Arial" w:eastAsia="Arial" w:hAnsi="Arial" w:cs="Arial"/>
-          <w:b/>
-          <w:bCs/>
-        </w:rPr>
-      </w:pPr>
-    </w:p>
-    <w:p>
-      <w:pPr>
-        <w:rPr>
-          <w:rFonts w:ascii="Arial" w:eastAsia="Arial" w:hAnsi="Arial" w:cs="Arial"/>
-        </w:rPr>
-      </w:pPr>
-      <w:r>
-        <w:rPr>
-          <w:rFonts w:ascii="Arial" w:eastAsia="Arial" w:hAnsi="Arial" w:cs="Arial"/>
-        </w:rPr>
+        </w:rPr>
+      </w:pPr>
+      <w:r>
+        <w:rPr>
+          <w:rFonts w:ascii="Arial" w:eastAsia="Arial" w:hAnsi="Arial" w:cs="Arial"/>
+        </w:rPr>
+        <w:lastRenderedPageBreak/>
         <w:t xml:space="preserve">Se le pide al usuario 2 </w:t>
       </w:r>
       <w:r>
@@ -7200,23 +6047,13 @@
         </w:rPr>
         <w:t xml:space="preserve">que serán </w:t>
       </w:r>
-      <w:proofErr w:type="spellStart"/>
-      <w:r>
-        <w:rPr>
-          <w:rFonts w:ascii="Arial" w:eastAsia="Arial" w:hAnsi="Arial" w:cs="Arial"/>
-          <w:b/>
-          <w:bCs/>
-        </w:rPr>
-        <w:t>líneas_n</w:t>
-      </w:r>
-      <w:proofErr w:type="spellEnd"/>
-      <w:r>
-        <w:rPr>
-          <w:rFonts w:ascii="Arial" w:eastAsia="Arial" w:hAnsi="Arial" w:cs="Arial"/>
-          <w:b/>
-          <w:bCs/>
-        </w:rPr>
-        <w:t xml:space="preserve"> y archivo </w:t>
+      <w:r>
+        <w:rPr>
+          <w:rFonts w:ascii="Arial" w:eastAsia="Arial" w:hAnsi="Arial" w:cs="Arial"/>
+          <w:b/>
+          <w:bCs/>
+        </w:rPr>
+        <w:t xml:space="preserve">líneas_n y archivo </w:t>
       </w:r>
       <w:r>
         <w:rPr>
@@ -7373,91 +6210,71 @@
         </w:rPr>
         <w:t xml:space="preserve"> </w:t>
       </w:r>
-      <w:proofErr w:type="spellStart"/>
-      <w:r>
-        <w:rPr>
-          <w:rFonts w:ascii="Arial" w:eastAsia="Arial" w:hAnsi="Arial" w:cs="Arial"/>
-          <w:b/>
-          <w:bCs/>
-        </w:rPr>
-        <w:t>líneas_n</w:t>
-      </w:r>
-      <w:proofErr w:type="spellEnd"/>
-      <w:r>
-        <w:rPr>
-          <w:rFonts w:ascii="Arial" w:eastAsia="Arial" w:hAnsi="Arial" w:cs="Arial"/>
-          <w:b/>
-          <w:bCs/>
+      <w:r>
+        <w:rPr>
+          <w:rFonts w:ascii="Arial" w:eastAsia="Arial" w:hAnsi="Arial" w:cs="Arial"/>
+          <w:b/>
+          <w:bCs/>
+        </w:rPr>
+        <w:t xml:space="preserve">líneas_n </w:t>
+      </w:r>
+      <w:r>
+        <w:rPr>
+          <w:rFonts w:ascii="Arial" w:eastAsia="Arial" w:hAnsi="Arial" w:cs="Arial"/>
+        </w:rPr>
+        <w:t>líneas del</w:t>
+      </w:r>
+    </w:p>
+    <w:p>
+      <w:pPr>
+        <w:ind w:left="708" w:hanging="708"/>
+        <w:rPr>
+          <w:rFonts w:ascii="Arial" w:eastAsia="Arial" w:hAnsi="Arial" w:cs="Arial"/>
+        </w:rPr>
+      </w:pPr>
+      <w:r>
+        <w:rPr>
+          <w:rFonts w:ascii="Arial" w:eastAsia="Arial" w:hAnsi="Arial" w:cs="Arial"/>
+        </w:rPr>
+        <w:t xml:space="preserve">archivo </w:t>
+      </w:r>
+      <w:r>
+        <w:rPr>
+          <w:rFonts w:ascii="Arial" w:eastAsia="Arial" w:hAnsi="Arial" w:cs="Arial"/>
+        </w:rPr>
+        <w:t xml:space="preserve">y </w:t>
+      </w:r>
+      <w:r>
+        <w:rPr>
+          <w:rFonts w:ascii="Arial" w:eastAsia="Arial" w:hAnsi="Arial" w:cs="Arial"/>
+        </w:rPr>
+        <w:t>usamos</w:t>
+      </w:r>
+      <w:r>
+        <w:rPr>
+          <w:rFonts w:ascii="Arial" w:eastAsia="Arial" w:hAnsi="Arial" w:cs="Arial"/>
+        </w:rPr>
+        <w:t xml:space="preserve"> el </w:t>
+      </w:r>
+      <w:r>
+        <w:rPr>
+          <w:rFonts w:ascii="Arial" w:eastAsia="Arial" w:hAnsi="Arial" w:cs="Arial"/>
+        </w:rPr>
+        <w:t>comando</w:t>
+      </w:r>
+      <w:r>
+        <w:rPr>
+          <w:rFonts w:ascii="Arial" w:eastAsia="Arial" w:hAnsi="Arial" w:cs="Arial"/>
         </w:rPr>
         <w:t xml:space="preserve"> </w:t>
       </w:r>
       <w:r>
         <w:rPr>
           <w:rFonts w:ascii="Arial" w:eastAsia="Arial" w:hAnsi="Arial" w:cs="Arial"/>
-        </w:rPr>
-        <w:t>líneas del</w:t>
-      </w:r>
-    </w:p>
-    <w:p>
-      <w:pPr>
-        <w:ind w:left="708" w:hanging="708"/>
-        <w:rPr>
-          <w:rFonts w:ascii="Arial" w:eastAsia="Arial" w:hAnsi="Arial" w:cs="Arial"/>
-        </w:rPr>
-      </w:pPr>
-      <w:r>
-        <w:rPr>
-          <w:rFonts w:ascii="Arial" w:eastAsia="Arial" w:hAnsi="Arial" w:cs="Arial"/>
-        </w:rPr>
-        <w:t xml:space="preserve">archivo </w:t>
-      </w:r>
-      <w:r>
-        <w:rPr>
-          <w:rFonts w:ascii="Arial" w:eastAsia="Arial" w:hAnsi="Arial" w:cs="Arial"/>
-        </w:rPr>
-        <w:t xml:space="preserve">y </w:t>
-      </w:r>
-      <w:r>
-        <w:rPr>
-          <w:rFonts w:ascii="Arial" w:eastAsia="Arial" w:hAnsi="Arial" w:cs="Arial"/>
-        </w:rPr>
-        <w:t>usamos</w:t>
-      </w:r>
-      <w:r>
-        <w:rPr>
-          <w:rFonts w:ascii="Arial" w:eastAsia="Arial" w:hAnsi="Arial" w:cs="Arial"/>
-        </w:rPr>
-        <w:t xml:space="preserve"> el </w:t>
-      </w:r>
-      <w:r>
-        <w:rPr>
-          <w:rFonts w:ascii="Arial" w:eastAsia="Arial" w:hAnsi="Arial" w:cs="Arial"/>
-        </w:rPr>
-        <w:t>comando</w:t>
-      </w:r>
-      <w:r>
-        <w:rPr>
-          <w:rFonts w:ascii="Arial" w:eastAsia="Arial" w:hAnsi="Arial" w:cs="Arial"/>
-        </w:rPr>
-        <w:t xml:space="preserve"> </w:t>
-      </w:r>
-      <w:proofErr w:type="spellStart"/>
-      <w:r>
-        <w:rPr>
-          <w:rFonts w:ascii="Arial" w:eastAsia="Arial" w:hAnsi="Arial" w:cs="Arial"/>
-          <w:b/>
-          <w:bCs/>
-        </w:rPr>
-        <w:t>tail</w:t>
-      </w:r>
-      <w:proofErr w:type="spellEnd"/>
-      <w:r>
-        <w:rPr>
-          <w:rFonts w:ascii="Arial" w:eastAsia="Arial" w:hAnsi="Arial" w:cs="Arial"/>
-          <w:b/>
-          <w:bCs/>
-        </w:rPr>
-        <w:t xml:space="preserve"> </w:t>
+          <w:b/>
+          <w:bCs/>
+        </w:rPr>
+        <w:t xml:space="preserve">tail </w:t>
       </w:r>
       <w:r>
         <w:rPr>
@@ -7465,23 +6282,13 @@
         </w:rPr>
         <w:t xml:space="preserve">para imprimir las ultimas </w:t>
       </w:r>
-      <w:proofErr w:type="spellStart"/>
-      <w:r>
-        <w:rPr>
-          <w:rFonts w:ascii="Arial" w:eastAsia="Arial" w:hAnsi="Arial" w:cs="Arial"/>
-          <w:b/>
-          <w:bCs/>
-        </w:rPr>
-        <w:t>líneas_n</w:t>
-      </w:r>
-      <w:proofErr w:type="spellEnd"/>
-      <w:r>
-        <w:rPr>
-          <w:rFonts w:ascii="Arial" w:eastAsia="Arial" w:hAnsi="Arial" w:cs="Arial"/>
-          <w:b/>
-          <w:bCs/>
-        </w:rPr>
-        <w:t xml:space="preserve"> </w:t>
+      <w:r>
+        <w:rPr>
+          <w:rFonts w:ascii="Arial" w:eastAsia="Arial" w:hAnsi="Arial" w:cs="Arial"/>
+          <w:b/>
+          <w:bCs/>
+        </w:rPr>
+        <w:t xml:space="preserve">líneas_n </w:t>
       </w:r>
       <w:r>
         <w:rPr>
@@ -7706,25 +6513,8 @@
           <w:b/>
           <w:bCs/>
         </w:rPr>
-        <w:t xml:space="preserve">Hacer un </w:t>
-      </w:r>
-      <w:proofErr w:type="spellStart"/>
-      <w:r>
-        <w:rPr>
-          <w:rFonts w:ascii="Arial" w:eastAsia="Arial" w:hAnsi="Arial" w:cs="Arial"/>
-          <w:b/>
-          <w:bCs/>
-        </w:rPr>
-        <w:t>shell</w:t>
-      </w:r>
-      <w:proofErr w:type="spellEnd"/>
-      <w:r>
-        <w:rPr>
-          <w:rFonts w:ascii="Arial" w:eastAsia="Arial" w:hAnsi="Arial" w:cs="Arial"/>
-          <w:b/>
-          <w:bCs/>
-        </w:rPr>
-        <w:t xml:space="preserve"> que lea el nombre de un archivo, enseguida pregunte los permisos </w:t>
+        <w:lastRenderedPageBreak/>
+        <w:t xml:space="preserve">Hacer un shell que lea el nombre de un archivo, enseguida pregunte los permisos </w:t>
       </w:r>
       <w:r>
         <w:rPr>
@@ -7895,6 +6685,7 @@
         <w:rPr>
           <w:rFonts w:ascii="Arial" w:eastAsia="Arial" w:hAnsi="Arial" w:cs="Arial"/>
         </w:rPr>
+        <w:lastRenderedPageBreak/>
         <w:t xml:space="preserve">Salida: </w:t>
       </w:r>
     </w:p>
@@ -8013,16 +6804,88 @@
         <w:rPr>
           <w:rFonts w:ascii="Arial" w:eastAsia="Arial" w:hAnsi="Arial" w:cs="Arial"/>
         </w:rPr>
-        <w:t xml:space="preserve"> quiere ponerle al archivo cada uno </w:t>
-      </w:r>
-      <w:proofErr w:type="spellStart"/>
-      <w:r>
-        <w:rPr>
-          <w:rFonts w:ascii="Arial" w:eastAsia="Arial" w:hAnsi="Arial" w:cs="Arial"/>
-        </w:rPr>
-        <w:t>esta</w:t>
-      </w:r>
-      <w:proofErr w:type="spellEnd"/>
+        <w:t xml:space="preserve"> quiere ponerle al archivo cada uno esta </w:t>
+      </w:r>
+      <w:r>
+        <w:rPr>
+          <w:rFonts w:ascii="Arial" w:eastAsia="Arial" w:hAnsi="Arial" w:cs="Arial"/>
+        </w:rPr>
+        <w:t xml:space="preserve">separado por </w:t>
+      </w:r>
+      <w:r>
+        <w:rPr>
+          <w:rFonts w:ascii="Arial" w:eastAsia="Arial" w:hAnsi="Arial" w:cs="Arial"/>
+          <w:b/>
+          <w:bCs/>
+        </w:rPr>
+        <w:t>permisos del usuario, permiso de grupo y otros.</w:t>
+      </w:r>
+    </w:p>
+    <w:p>
+      <w:pPr>
+        <w:rPr>
+          <w:rFonts w:ascii="Arial" w:eastAsia="Arial" w:hAnsi="Arial" w:cs="Arial"/>
+        </w:rPr>
+      </w:pPr>
+      <w:r>
+        <w:rPr>
+          <w:rFonts w:ascii="Arial" w:eastAsia="Arial" w:hAnsi="Arial" w:cs="Arial"/>
+        </w:rPr>
+        <w:t xml:space="preserve">Por lo que se toma esos permisos el formato que se espera es </w:t>
+      </w:r>
+      <w:r>
+        <w:rPr>
+          <w:rFonts w:ascii="Arial" w:eastAsia="Arial" w:hAnsi="Arial" w:cs="Arial"/>
+          <w:b/>
+          <w:bCs/>
+        </w:rPr>
+        <w:t xml:space="preserve">rwx </w:t>
+      </w:r>
+      <w:r>
+        <w:rPr>
+          <w:rFonts w:ascii="Arial" w:eastAsia="Arial" w:hAnsi="Arial" w:cs="Arial"/>
+        </w:rPr>
+        <w:t xml:space="preserve">si un permiso quiere ser quitado le ponemos </w:t>
+      </w:r>
+      <w:r>
+        <w:rPr>
+          <w:rFonts w:ascii="Arial" w:eastAsia="Arial" w:hAnsi="Arial" w:cs="Arial"/>
+          <w:b/>
+          <w:bCs/>
+        </w:rPr>
+        <w:t xml:space="preserve">– </w:t>
+      </w:r>
+      <w:r>
+        <w:rPr>
+          <w:rFonts w:ascii="Arial" w:eastAsia="Arial" w:hAnsi="Arial" w:cs="Arial"/>
+        </w:rPr>
+        <w:t>en la posición en donde debería de ir el permi</w:t>
+      </w:r>
+      <w:r>
+        <w:rPr>
+          <w:rFonts w:ascii="Arial" w:eastAsia="Arial" w:hAnsi="Arial" w:cs="Arial"/>
+        </w:rPr>
+        <w:t xml:space="preserve">so </w:t>
+      </w:r>
+    </w:p>
+    <w:p>
+      <w:pPr>
+        <w:rPr>
+          <w:rFonts w:ascii="Arial" w:eastAsia="Arial" w:hAnsi="Arial" w:cs="Arial"/>
+        </w:rPr>
+      </w:pPr>
+      <w:r>
+        <w:rPr>
+          <w:rFonts w:ascii="Arial" w:eastAsia="Arial" w:hAnsi="Arial" w:cs="Arial"/>
+        </w:rPr>
+        <w:t xml:space="preserve">Como el usuario la forma de ingresar seria con – lo que hacemos es suprimir en donde se supone que quita los permisos, si se da el caso con el </w:t>
+      </w:r>
+      <w:r>
+        <w:rPr>
+          <w:rFonts w:ascii="Arial" w:eastAsia="Arial" w:hAnsi="Arial" w:cs="Arial"/>
+        </w:rPr>
+        <w:t>comando</w:t>
+      </w:r>
       <w:r>
         <w:rPr>
           <w:rFonts w:ascii="Arial" w:eastAsia="Arial" w:hAnsi="Arial" w:cs="Arial"/>
@@ -8032,116 +6895,10 @@
       <w:r>
         <w:rPr>
           <w:rFonts w:ascii="Arial" w:eastAsia="Arial" w:hAnsi="Arial" w:cs="Arial"/>
-        </w:rPr>
-        <w:t xml:space="preserve">separado por </w:t>
-      </w:r>
-      <w:r>
-        <w:rPr>
-          <w:rFonts w:ascii="Arial" w:eastAsia="Arial" w:hAnsi="Arial" w:cs="Arial"/>
-          <w:b/>
-          <w:bCs/>
-        </w:rPr>
-        <w:t>permisos del usuario, permiso de grupo y otros.</w:t>
-      </w:r>
-    </w:p>
-    <w:p>
-      <w:pPr>
-        <w:rPr>
-          <w:rFonts w:ascii="Arial" w:eastAsia="Arial" w:hAnsi="Arial" w:cs="Arial"/>
-        </w:rPr>
-      </w:pPr>
-      <w:r>
-        <w:rPr>
-          <w:rFonts w:ascii="Arial" w:eastAsia="Arial" w:hAnsi="Arial" w:cs="Arial"/>
-        </w:rPr>
-        <w:t xml:space="preserve">Por lo que se toma esos permisos el formato que se espera es </w:t>
-      </w:r>
-      <w:proofErr w:type="spellStart"/>
-      <w:r>
-        <w:rPr>
-          <w:rFonts w:ascii="Arial" w:eastAsia="Arial" w:hAnsi="Arial" w:cs="Arial"/>
-          <w:b/>
-          <w:bCs/>
-        </w:rPr>
-        <w:t>rwx</w:t>
-      </w:r>
-      <w:proofErr w:type="spellEnd"/>
-      <w:r>
-        <w:rPr>
-          <w:rFonts w:ascii="Arial" w:eastAsia="Arial" w:hAnsi="Arial" w:cs="Arial"/>
-          <w:b/>
-          <w:bCs/>
-        </w:rPr>
-        <w:t xml:space="preserve"> </w:t>
-      </w:r>
-      <w:r>
-        <w:rPr>
-          <w:rFonts w:ascii="Arial" w:eastAsia="Arial" w:hAnsi="Arial" w:cs="Arial"/>
-        </w:rPr>
-        <w:t xml:space="preserve">si un permiso quiere ser quitado le ponemos </w:t>
-      </w:r>
-      <w:r>
-        <w:rPr>
-          <w:rFonts w:ascii="Arial" w:eastAsia="Arial" w:hAnsi="Arial" w:cs="Arial"/>
-          <w:b/>
-          <w:bCs/>
-        </w:rPr>
-        <w:t xml:space="preserve">– </w:t>
-      </w:r>
-      <w:r>
-        <w:rPr>
-          <w:rFonts w:ascii="Arial" w:eastAsia="Arial" w:hAnsi="Arial" w:cs="Arial"/>
-        </w:rPr>
-        <w:t>en la posición en donde debería de ir el permi</w:t>
-      </w:r>
-      <w:r>
-        <w:rPr>
-          <w:rFonts w:ascii="Arial" w:eastAsia="Arial" w:hAnsi="Arial" w:cs="Arial"/>
-        </w:rPr>
-        <w:t xml:space="preserve">so </w:t>
-      </w:r>
-    </w:p>
-    <w:p>
-      <w:pPr>
-        <w:rPr>
-          <w:rFonts w:ascii="Arial" w:eastAsia="Arial" w:hAnsi="Arial" w:cs="Arial"/>
-        </w:rPr>
-      </w:pPr>
-      <w:r>
-        <w:rPr>
-          <w:rFonts w:ascii="Arial" w:eastAsia="Arial" w:hAnsi="Arial" w:cs="Arial"/>
-        </w:rPr>
-        <w:t xml:space="preserve">Como el usuario la forma de ingresar seria con – lo que hacemos es suprimir en donde se supone que quita los permisos, si se da el caso con el </w:t>
-      </w:r>
-      <w:r>
-        <w:rPr>
-          <w:rFonts w:ascii="Arial" w:eastAsia="Arial" w:hAnsi="Arial" w:cs="Arial"/>
-        </w:rPr>
-        <w:t>comando</w:t>
-      </w:r>
-      <w:r>
-        <w:rPr>
-          <w:rFonts w:ascii="Arial" w:eastAsia="Arial" w:hAnsi="Arial" w:cs="Arial"/>
-        </w:rPr>
-        <w:t xml:space="preserve"> </w:t>
-      </w:r>
-      <w:proofErr w:type="spellStart"/>
-      <w:r>
-        <w:rPr>
-          <w:rFonts w:ascii="Arial" w:eastAsia="Arial" w:hAnsi="Arial" w:cs="Arial"/>
-          <w:b/>
-          <w:bCs/>
-        </w:rPr>
-        <w:t>tr</w:t>
-      </w:r>
-      <w:proofErr w:type="spellEnd"/>
-      <w:r>
-        <w:rPr>
-          <w:rFonts w:ascii="Arial" w:eastAsia="Arial" w:hAnsi="Arial" w:cs="Arial"/>
-          <w:b/>
-          <w:bCs/>
-        </w:rPr>
-        <w:t xml:space="preserve"> </w:t>
+          <w:b/>
+          <w:bCs/>
+        </w:rPr>
+        <w:t xml:space="preserve">tr </w:t>
       </w:r>
       <w:r>
         <w:rPr>
@@ -8157,23 +6914,13 @@
         </w:rPr>
         <w:t xml:space="preserve">entonces queda limpio el formato para poderlo pasar al comando </w:t>
       </w:r>
-      <w:proofErr w:type="spellStart"/>
-      <w:r>
-        <w:rPr>
-          <w:rFonts w:ascii="Arial" w:eastAsia="Arial" w:hAnsi="Arial" w:cs="Arial"/>
-          <w:b/>
-          <w:bCs/>
-        </w:rPr>
-        <w:t>chmod</w:t>
-      </w:r>
-      <w:proofErr w:type="spellEnd"/>
-      <w:r>
-        <w:rPr>
-          <w:rFonts w:ascii="Arial" w:eastAsia="Arial" w:hAnsi="Arial" w:cs="Arial"/>
-          <w:b/>
-          <w:bCs/>
-        </w:rPr>
-        <w:t xml:space="preserve"> </w:t>
+      <w:r>
+        <w:rPr>
+          <w:rFonts w:ascii="Arial" w:eastAsia="Arial" w:hAnsi="Arial" w:cs="Arial"/>
+          <w:b/>
+          <w:bCs/>
+        </w:rPr>
+        <w:t xml:space="preserve">chmod </w:t>
       </w:r>
       <w:r>
         <w:rPr>
@@ -8210,7 +6957,7 @@
         <w:rPr>
           <w:rFonts w:ascii="Arial" w:eastAsia="Arial" w:hAnsi="Arial" w:cs="Arial"/>
         </w:rPr>
-        <w:t>último</w:t>
+        <w:t>último,</w:t>
       </w:r>
       <w:r>
         <w:rPr>
@@ -8218,23 +6965,13 @@
         </w:rPr>
         <w:t xml:space="preserve"> solo listo los archivos dentro del directorio mostrando los permisos con </w:t>
       </w:r>
-      <w:proofErr w:type="spellStart"/>
-      <w:r>
-        <w:rPr>
-          <w:rFonts w:ascii="Arial" w:eastAsia="Arial" w:hAnsi="Arial" w:cs="Arial"/>
-          <w:b/>
-          <w:bCs/>
-        </w:rPr>
-        <w:t>ls</w:t>
-      </w:r>
-      <w:proofErr w:type="spellEnd"/>
-      <w:r>
-        <w:rPr>
-          <w:rFonts w:ascii="Arial" w:eastAsia="Arial" w:hAnsi="Arial" w:cs="Arial"/>
-          <w:b/>
-          <w:bCs/>
-        </w:rPr>
-        <w:t xml:space="preserve"> -l </w:t>
+      <w:r>
+        <w:rPr>
+          <w:rFonts w:ascii="Arial" w:eastAsia="Arial" w:hAnsi="Arial" w:cs="Arial"/>
+          <w:b/>
+          <w:bCs/>
+        </w:rPr>
+        <w:t xml:space="preserve">ls -l </w:t>
       </w:r>
     </w:p>
     <w:p>
@@ -8315,25 +7052,7 @@
           <w:b/>
           <w:bCs/>
         </w:rPr>
-        <w:t xml:space="preserve">Hacer un </w:t>
-      </w:r>
-      <w:proofErr w:type="spellStart"/>
-      <w:r>
-        <w:rPr>
-          <w:rFonts w:ascii="Arial" w:eastAsia="Arial" w:hAnsi="Arial" w:cs="Arial"/>
-          <w:b/>
-          <w:bCs/>
-        </w:rPr>
-        <w:t>shell</w:t>
-      </w:r>
-      <w:proofErr w:type="spellEnd"/>
-      <w:r>
-        <w:rPr>
-          <w:rFonts w:ascii="Arial" w:eastAsia="Arial" w:hAnsi="Arial" w:cs="Arial"/>
-          <w:b/>
-          <w:bCs/>
-        </w:rPr>
-        <w:t xml:space="preserve"> que lea las medidas de un terreno rectangular y determine el costo que tendrá cercar el terreno si considera que el precio por metro lineal de material es de 150 pesos y la mano de obra tiene un costo de 100 pesos. Se pide mostrar el perímetro del terreno, el total por concepto de mano de obra, el total por concepto de material y el costo total de la construcción.</w:t>
+        <w:t>Hacer un shell que lea las medidas de un terreno rectangular y determine el costo que tendrá cercar el terreno si considera que el precio por metro lineal de material es de 150 pesos y la mano de obra tiene un costo de 100 pesos. Se pide mostrar el perímetro del terreno, el total por concepto de mano de obra, el total por concepto de material y el costo total de la construcción.</w:t>
       </w:r>
       <w:r>
         <w:rPr>
@@ -8491,44 +7210,81 @@
         <w:rPr>
           <w:rFonts w:ascii="Arial" w:eastAsia="Arial" w:hAnsi="Arial" w:cs="Arial"/>
         </w:rPr>
-        <w:t xml:space="preserve">Usamos el operador $(()) para poder realizar el </w:t>
-      </w:r>
-      <w:proofErr w:type="spellStart"/>
-      <w:r>
-        <w:rPr>
-          <w:rFonts w:ascii="Arial" w:eastAsia="Arial" w:hAnsi="Arial" w:cs="Arial"/>
-        </w:rPr>
-        <w:t>calculo</w:t>
-      </w:r>
-      <w:proofErr w:type="spellEnd"/>
-      <w:r>
-        <w:rPr>
-          <w:rFonts w:ascii="Arial" w:eastAsia="Arial" w:hAnsi="Arial" w:cs="Arial"/>
-        </w:rPr>
-        <w:t xml:space="preserve"> dado a que todo lo que se ingresa en </w:t>
-      </w:r>
-      <w:proofErr w:type="spellStart"/>
-      <w:r>
-        <w:rPr>
-          <w:rFonts w:ascii="Arial" w:eastAsia="Arial" w:hAnsi="Arial" w:cs="Arial"/>
-        </w:rPr>
-        <w:t>bash</w:t>
-      </w:r>
-      <w:proofErr w:type="spellEnd"/>
-      <w:r>
-        <w:rPr>
-          <w:rFonts w:ascii="Arial" w:eastAsia="Arial" w:hAnsi="Arial" w:cs="Arial"/>
-        </w:rPr>
-        <w:t xml:space="preserve"> es de formato </w:t>
-      </w:r>
-      <w:proofErr w:type="spellStart"/>
-      <w:r>
-        <w:rPr>
-          <w:rFonts w:ascii="Arial" w:eastAsia="Arial" w:hAnsi="Arial" w:cs="Arial"/>
-        </w:rPr>
-        <w:t>string</w:t>
-      </w:r>
-      <w:proofErr w:type="spellEnd"/>
+        <w:t xml:space="preserve">Usamos el operador $(()) para poder realizar el calculo dado a que todo lo que se ingresa en bash es de formato string </w:t>
+      </w:r>
+      <w:r>
+        <w:rPr>
+          <w:rFonts w:ascii="Arial" w:eastAsia="Arial" w:hAnsi="Arial" w:cs="Arial"/>
+        </w:rPr>
+        <w:t xml:space="preserve">hacemos uso del operador para hacer los cálculos. </w:t>
+      </w:r>
+    </w:p>
+    <w:p>
+      <w:pPr>
+        <w:rPr>
+          <w:rFonts w:ascii="Arial" w:eastAsia="Arial" w:hAnsi="Arial" w:cs="Arial"/>
+        </w:rPr>
+      </w:pPr>
+    </w:p>
+    <w:p>
+      <w:pPr>
+        <w:rPr>
+          <w:rFonts w:ascii="Arial" w:eastAsia="Arial" w:hAnsi="Arial" w:cs="Arial"/>
+          <w:b/>
+          <w:bCs/>
+        </w:rPr>
+      </w:pPr>
+      <w:r>
+        <w:rPr>
+          <w:rFonts w:ascii="Arial" w:eastAsia="Arial" w:hAnsi="Arial" w:cs="Arial"/>
+          <w:b/>
+          <w:bCs/>
+        </w:rPr>
+        <w:t xml:space="preserve">Conclusión </w:t>
+      </w:r>
+    </w:p>
+    <w:p>
+      <w:pPr>
+        <w:rPr>
+          <w:rFonts w:ascii="Arial" w:eastAsia="Arial" w:hAnsi="Arial" w:cs="Arial"/>
+        </w:rPr>
+      </w:pPr>
+      <w:r>
+        <w:rPr>
+          <w:rFonts w:ascii="Arial" w:eastAsia="Arial" w:hAnsi="Arial" w:cs="Arial"/>
+        </w:rPr>
+        <w:t>Durante el desarrollo de la practica</w:t>
+      </w:r>
+      <w:r>
+        <w:rPr>
+          <w:rFonts w:ascii="Arial" w:eastAsia="Arial" w:hAnsi="Arial" w:cs="Arial"/>
+        </w:rPr>
+        <w:t xml:space="preserve"> se pudieron desarrollar las habilidades del desarrollo de scritps con bash</w:t>
+      </w:r>
+      <w:r>
+        <w:rPr>
+          <w:rFonts w:ascii="Arial" w:eastAsia="Arial" w:hAnsi="Arial" w:cs="Arial"/>
+        </w:rPr>
+        <w:t xml:space="preserve">, algo muy importante en un sistema operativo, el scritp puede desarrollar tareas complejas, todo esta en un archivo que puede ejecutar </w:t>
+      </w:r>
+      <w:r>
+        <w:rPr>
+          <w:rFonts w:ascii="Arial" w:eastAsia="Arial" w:hAnsi="Arial" w:cs="Arial"/>
+        </w:rPr>
+        <w:t>tantas variables</w:t>
+      </w:r>
+      <w:r>
+        <w:rPr>
+          <w:rFonts w:ascii="Arial" w:eastAsia="Arial" w:hAnsi="Arial" w:cs="Arial"/>
+        </w:rPr>
+        <w:t xml:space="preserve">, funciones, </w:t>
+      </w:r>
+      <w:r>
+        <w:rPr>
+          <w:rFonts w:ascii="Arial" w:eastAsia="Arial" w:hAnsi="Arial" w:cs="Arial"/>
+        </w:rPr>
+        <w:t>estructuras</w:t>
+      </w:r>
       <w:r>
         <w:rPr>
           <w:rFonts w:ascii="Arial" w:eastAsia="Arial" w:hAnsi="Arial" w:cs="Arial"/>
@@ -8539,40 +7295,115 @@
         <w:rPr>
           <w:rFonts w:ascii="Arial" w:eastAsia="Arial" w:hAnsi="Arial" w:cs="Arial"/>
         </w:rPr>
-        <w:t xml:space="preserve">hacemos uso del operador para hacer los cálculos. </w:t>
-      </w:r>
-    </w:p>
-    <w:p>
-      <w:pPr>
-        <w:rPr>
-          <w:rFonts w:ascii="Arial" w:eastAsia="Arial" w:hAnsi="Arial" w:cs="Arial"/>
-        </w:rPr>
-      </w:pPr>
-    </w:p>
-    <w:p>
-      <w:pPr>
-        <w:rPr>
-          <w:rFonts w:ascii="Arial" w:eastAsia="Arial" w:hAnsi="Arial" w:cs="Arial"/>
-        </w:rPr>
-      </w:pPr>
-      <w:r>
-        <w:rPr>
-          <w:rFonts w:ascii="Arial" w:eastAsia="Arial" w:hAnsi="Arial" w:cs="Arial"/>
-        </w:rPr>
-        <w:t xml:space="preserve">Conclusión </w:t>
-      </w:r>
-    </w:p>
-    <w:p>
-      <w:pPr>
-        <w:rPr>
-          <w:rFonts w:ascii="Arial" w:eastAsia="Arial" w:hAnsi="Arial" w:cs="Arial"/>
-        </w:rPr>
-      </w:pPr>
-      <w:r>
-        <w:rPr>
-          <w:rFonts w:ascii="Arial" w:eastAsia="Arial" w:hAnsi="Arial" w:cs="Arial"/>
+        <w:t>selectivas</w:t>
+      </w:r>
+      <w:r>
+        <w:rPr>
+          <w:rFonts w:ascii="Arial" w:eastAsia="Arial" w:hAnsi="Arial" w:cs="Arial"/>
+        </w:rPr>
+        <w:t>, de repetición, etc. Asi como ejecutar comandos UNIX</w:t>
+      </w:r>
+      <w:r>
+        <w:rPr>
+          <w:rFonts w:ascii="Arial" w:eastAsia="Arial" w:hAnsi="Arial" w:cs="Arial"/>
+        </w:rPr>
+        <w:t xml:space="preserve">, </w:t>
+      </w:r>
+      <w:r>
+        <w:rPr>
+          <w:rFonts w:ascii="Arial" w:eastAsia="Arial" w:hAnsi="Arial" w:cs="Arial"/>
+        </w:rPr>
+        <w:t xml:space="preserve">con estos de pueden hacer </w:t>
+      </w:r>
+      <w:r>
+        <w:rPr>
+          <w:rFonts w:ascii="Arial" w:eastAsia="Arial" w:hAnsi="Arial" w:cs="Arial"/>
+        </w:rPr>
+        <w:t>proceso</w:t>
+      </w:r>
+      <w:r>
+        <w:rPr>
+          <w:rFonts w:ascii="Arial" w:eastAsia="Arial" w:hAnsi="Arial" w:cs="Arial"/>
+        </w:rPr>
+        <w:t xml:space="preserve"> automáticos, muy importantes </w:t>
+      </w:r>
+      <w:r>
+        <w:rPr>
+          <w:rFonts w:ascii="Arial" w:eastAsia="Arial" w:hAnsi="Arial" w:cs="Arial"/>
+        </w:rPr>
+        <w:t>incluso</w:t>
+      </w:r>
+      <w:r>
+        <w:rPr>
+          <w:rFonts w:ascii="Arial" w:eastAsia="Arial" w:hAnsi="Arial" w:cs="Arial"/>
+        </w:rPr>
+        <w:t xml:space="preserve"> cunado se desarrolla una app el hacer scripts para automatizar tareas que pueden ser repetitivas </w:t>
+      </w:r>
+    </w:p>
+    <w:p>
+      <w:pPr>
+        <w:rPr>
+          <w:rFonts w:ascii="Arial" w:eastAsia="Arial" w:hAnsi="Arial" w:cs="Arial"/>
+          <w:b/>
+          <w:bCs/>
+        </w:rPr>
+      </w:pPr>
+      <w:r>
+        <w:rPr>
+          <w:rFonts w:ascii="Arial" w:eastAsia="Arial" w:hAnsi="Arial" w:cs="Arial"/>
+          <w:b/>
+          <w:bCs/>
         </w:rPr>
         <w:t xml:space="preserve">Dificultades  </w:t>
+      </w:r>
+    </w:p>
+    <w:p>
+      <w:pPr>
+        <w:rPr>
+          <w:rFonts w:ascii="Arial" w:eastAsia="Arial" w:hAnsi="Arial" w:cs="Arial"/>
+        </w:rPr>
+      </w:pPr>
+      <w:r>
+        <w:rPr>
+          <w:rFonts w:ascii="Arial" w:eastAsia="Arial" w:hAnsi="Arial" w:cs="Arial"/>
+        </w:rPr>
+        <w:t xml:space="preserve">El único </w:t>
+      </w:r>
+      <w:r>
+        <w:rPr>
+          <w:rFonts w:ascii="Arial" w:eastAsia="Arial" w:hAnsi="Arial" w:cs="Arial"/>
+        </w:rPr>
+        <w:t>inconveniente</w:t>
+      </w:r>
+      <w:r>
+        <w:rPr>
+          <w:rFonts w:ascii="Arial" w:eastAsia="Arial" w:hAnsi="Arial" w:cs="Arial"/>
+        </w:rPr>
+        <w:t xml:space="preserve"> fue el tender mas o menos como es que trabaja este lenguaje, como funciona, al final es un lenguaje luego y toma tiempo en </w:t>
+      </w:r>
+      <w:r>
+        <w:rPr>
+          <w:rFonts w:ascii="Arial" w:eastAsia="Arial" w:hAnsi="Arial" w:cs="Arial"/>
+        </w:rPr>
+        <w:t>entender</w:t>
+      </w:r>
+      <w:r>
+        <w:rPr>
+          <w:rFonts w:ascii="Arial" w:eastAsia="Arial" w:hAnsi="Arial" w:cs="Arial"/>
+        </w:rPr>
+        <w:t xml:space="preserve"> su </w:t>
+      </w:r>
+      <w:r>
+        <w:rPr>
+          <w:rFonts w:ascii="Arial" w:eastAsia="Arial" w:hAnsi="Arial" w:cs="Arial"/>
+        </w:rPr>
+        <w:t>sintaxis</w:t>
+      </w:r>
+      <w:r>
+        <w:rPr>
+          <w:rFonts w:ascii="Arial" w:eastAsia="Arial" w:hAnsi="Arial" w:cs="Arial"/>
+        </w:rPr>
+        <w:t xml:space="preserve"> y su flujo de trabajo, pero mas allá no hubieras problemas graves, puede que el como era realizar operaciones matemáticas puesto que bash todo lo que ingresa es una cadena de caracteres. </w:t>
       </w:r>
     </w:p>
     <w:p>
@@ -10449,7 +9280,6 @@
   <w:style w:type="character" w:default="1" w:styleId="DefaultParagraphFont">
     <w:name w:val="Default Paragraph Font"/>
     <w:uiPriority w:val="1"/>
-    <w:semiHidden/>
     <w:unhideWhenUsed/>
   </w:style>
   <w:style w:type="table" w:default="1" w:styleId="TableNormal">

</xml_diff>